<commit_message>
Expand Phase 1 sector financial analysis
</commit_message>
<xml_diff>
--- a/reports/publication/Corporate_Financial_Deterioration_Phase1_Research_Report.docx
+++ b/reports/publication/Corporate_Financial_Deterioration_Phase1_Research_Report.docx
@@ -454,7 +454,7 @@
           <w:color w:val="667085"/>
           <w:sz w:val="17"/>
         </w:rPr>
-        <w:t>Figure 1. Latest evaluated risk-band distribution. Source: certified Power BI import workbook.</w:t>
+        <w:t>Figure 1. Latest evaluated risk-band distribution. Source: certified Phase 1 analysis workbook.</w:t>
       </w:r>
     </w:p>
     <w:p>
@@ -485,7 +485,7 @@
           <w:color w:val="202124"/>
           <w:sz w:val="21"/>
         </w:rPr>
-        <w:t>The primary question is whether observable changes in coverage, cash generation, leverage, peer-relative positioning, forecasted KPI trajectories, and macro conditions contain stable information about future debt-service deterioration. The unit of analysis is a filing-aware company-quarter decision point; the estimand is predictive ranking and calibrated early-warning performance, not a causal treatment effect.</w:t>
+        <w:t>The primary question is whether changes in interest coverage, cash generation, leverage, peer position, forecasted financial ratios, and economic conditions contain useful information about future debt-service deterioration. Each observation represents one company at one quarterly decision date, using only information available at that time. The study measures how well the model ranks and estimates risk; it does not attempt to prove that any feature causes deterioration.</w:t>
       </w:r>
     </w:p>
     <w:tbl>
@@ -612,7 +612,7 @@
                 <w:color w:val="202124"/>
                 <w:sz w:val="17"/>
               </w:rPr>
-              <w:t>H1: multivariate signals improve ranking</w:t>
+              <w:t>H1: combining signals improves ranking</w:t>
             </w:r>
           </w:p>
         </w:tc>
@@ -639,7 +639,7 @@
                 <w:color w:val="202124"/>
                 <w:sz w:val="17"/>
               </w:rPr>
-              <w:t>Compare prespecified feature increments by temporal OOF PR-AUC</w:t>
+              <w:t>Compare planned feature groups using time-ordered, out-of-sample PR-AUC</w:t>
             </w:r>
           </w:p>
         </w:tc>
@@ -666,7 +666,7 @@
                 <w:color w:val="202124"/>
                 <w:sz w:val="17"/>
               </w:rPr>
-              <w:t>Improvement must persist across folds and sectors</w:t>
+              <w:t>Improvement must persist across time periods and sectors</w:t>
             </w:r>
           </w:p>
         </w:tc>
@@ -722,7 +722,7 @@
                 <w:color w:val="202124"/>
                 <w:sz w:val="17"/>
               </w:rPr>
-              <w:t>Add leakage-safe 1Q/4Q KPI forecasts after historical and peer features</w:t>
+              <w:t>Add 1Q/4Q KPI forecasts built without future information</w:t>
             </w:r>
           </w:p>
         </w:tc>
@@ -749,7 +749,7 @@
                 <w:color w:val="202124"/>
                 <w:sz w:val="17"/>
               </w:rPr>
-              <w:t>Incremental OOF value without holdout tuning</w:t>
+              <w:t>Added value must appear before the final test period</w:t>
             </w:r>
           </w:p>
         </w:tc>
@@ -855,7 +855,7 @@
           <w:color w:val="202124"/>
           <w:sz w:val="21"/>
         </w:rPr>
-        <w:t>The study is observational and predictive. Consequently, feature importance is interpreted as conditional predictive association. It cannot establish that changing a balance-sheet variable would cause a corresponding change in deterioration risk.</w:t>
+        <w:t>This is an observational prediction study. Feature importance therefore shows which variables helped the model make predictions after considering the other inputs. It does not prove that changing a balance-sheet item would cause the company's risk to rise or fall.</w:t>
       </w:r>
     </w:p>
     <w:p>
@@ -886,7 +886,7 @@
           <w:color w:val="202124"/>
           <w:sz w:val="21"/>
         </w:rPr>
-        <w:t>Source selection. SEC EDGAR supplies public company fundamentals and filing dates; FRED/ALFRED supplies macroeconomic series. Public sources improve auditability and cost reproducibility, but introduce taxonomy heterogeneity, reporting lags, revisions, and limited distressed-firm coverage. Each acquisition is governed by a manifest with source parameters, retrieval time, checksum, and software version.</w:t>
+        <w:t>Source selection. SEC EDGAR supplies public company financial statements and filing dates, while FRED/ALFRED supplies economic data such as interest rates and business-cycle measures. These public sources make the analysis easier to verify and reproduce at low cost, but they also create data challenges. Companies may use different SEC tags or labels for the same financial concept, filings become available at different times, previously published values may later be revised, and the dataset contains relatively few severely distressed companies. Every download is therefore recorded in a tracking file that identifies the source, download settings, retrieval time, file-integrity check, and software version.</w:t>
       </w:r>
     </w:p>
     <w:p>
@@ -901,7 +901,7 @@
           <w:color w:val="202124"/>
           <w:sz w:val="21"/>
         </w:rPr>
-        <w:t>Panel construction. XBRL facts were mapped to economically consistent concepts, normalized to issuer fiscal quarters, and retained with filing/availability dates. This matters because a conventional calendar-quarter join can silently expose data before the market could have observed it. Decision keys preserve company, reporting period, and decision timestamp; the certified history contains 3,150 unique keys.</w:t>
+        <w:t>Panel construction. SEC XBRL tags were mapped to consistent financial concepts and aligned to each company's fiscal quarters. Filing and availability dates were retained so the model could not use a number before it became public. This point-in-time rule is important because joining everything by calendar quarter can accidentally introduce future information. The final history contains 3,150 unique company-quarter decision records.</w:t>
       </w:r>
     </w:p>
     <w:p>
@@ -1153,7 +1153,7 @@
                 <w:color w:val="202124"/>
                 <w:sz w:val="17"/>
               </w:rPr>
-              <w:t>Availability-date/as-of logic</w:t>
+              <w:t>Use each value only after its public availability date</w:t>
             </w:r>
           </w:p>
         </w:tc>
@@ -1180,7 +1180,7 @@
                 <w:color w:val="202124"/>
                 <w:sz w:val="17"/>
               </w:rPr>
-              <w:t>Prevents look-ahead bias from late filings, revised macro series, and future labels.</w:t>
+              <w:t>Prevents the model from learning from late filings, later revisions, or future outcomes.</w:t>
             </w:r>
           </w:p>
         </w:tc>
@@ -1292,7 +1292,7 @@
                 <w:color w:val="202124"/>
                 <w:sz w:val="17"/>
               </w:rPr>
-              <w:t>Missingness</w:t>
+              <w:t>Missing values</w:t>
             </w:r>
           </w:p>
         </w:tc>
@@ -1319,7 +1319,7 @@
                 <w:color w:val="202124"/>
                 <w:sz w:val="17"/>
               </w:rPr>
-              <w:t>Preserve legitimate nulls; fold-local preprocessing</w:t>
+              <w:t>Preserve valid blanks; estimate replacements within each training window</w:t>
             </w:r>
           </w:p>
         </w:tc>
@@ -1346,7 +1346,7 @@
                 <w:color w:val="202124"/>
                 <w:sz w:val="17"/>
               </w:rPr>
-              <w:t>Zero imputation would manufacture economic states, while global preprocessing would leak future distribution information.</w:t>
+              <w:t>Replacing every blank with zero creates false financial values, while using the full dataset would leak future information.</w:t>
             </w:r>
           </w:p>
         </w:tc>
@@ -1400,7 +1400,7 @@
           <w:color w:val="202124"/>
           <w:sz w:val="21"/>
         </w:rPr>
-        <w:t>The deterioration event is defined prospectively: future interest coverage must fall below 1.5x and decline at least 40% from the current level within the four-quarter horizon. The joint absolute-and-relative rule avoids labeling a small decline from an already strong level as severe while still recognizing economically consequential weakening. Adjacent quarterly horizons overlap, so observations are serially dependent and standard IID interpretations are inappropriate.</w:t>
+        <w:t>A deterioration event occurs when interest coverage falls below 1.5x and declines by at least 40% from its current level within the next four quarters. Requiring both conditions avoids treating a small decline from a strong starting point as a serious warning. Because neighboring quarters share part of the same four-quarter future window, the observations are related over time rather than fully independent.</w:t>
       </w:r>
     </w:p>
     <w:p>
@@ -1472,7 +1472,1143 @@
           <w:color w:val="17365D"/>
           <w:sz w:val="32"/>
         </w:rPr>
-        <w:t>4. Forecasting methodology: matching model structure to temporal financial data</w:t>
+        <w:t>4. Sector exploratory findings: financial structure, trends, and seasonality</w:t>
+      </w:r>
+    </w:p>
+    <w:p>
+      <w:pPr>
+        <w:pStyle w:val="Heading2"/>
+        <w:keepNext/>
+      </w:pPr>
+      <w:r>
+        <w:rPr>
+          <w:rFonts w:ascii="Calibri" w:hAnsi="Calibri"/>
+          <w:b/>
+          <w:i w:val="0"/>
+          <w:color w:val="17365D"/>
+          <w:sz w:val="26"/>
+        </w:rPr>
+        <w:t>4.1 Cross-sectional financial profile</w:t>
+      </w:r>
+    </w:p>
+    <w:p>
+      <w:pPr>
+        <w:spacing w:after="120" w:line="264" w:lineRule="auto"/>
+      </w:pPr>
+      <w:r>
+        <w:rPr>
+          <w:rFonts w:ascii="Calibri" w:hAnsi="Calibri"/>
+          <w:b/>
+          <w:i w:val="0"/>
+          <w:color w:val="17365D"/>
+          <w:sz w:val="21"/>
+        </w:rPr>
+        <w:t>Consumer Discretionary.</w:t>
+      </w:r>
+      <w:r>
+        <w:rPr>
+          <w:rFonts w:ascii="Calibri" w:hAnsi="Calibri"/>
+          <w:b w:val="0"/>
+          <w:i w:val="0"/>
+          <w:color w:val="202124"/>
+          <w:sz w:val="21"/>
+        </w:rPr>
+        <w:t xml:space="preserve"> Across the full panel, the typical Consumer Discretionary company had 5.25x interest coverage, a 10.12% free-cash-flow margin, and debt equal to 22.00% of assets. These averages describe a sector with greater normal debt-service capacity and internally generated cash than Utilities. The apparent strength is not uniform: 22.5% of company-quarter observations fell below 1.5x coverage, 16.4% had negative free-cash-flow margins, and 27.4% had debt above 40% of assets. The interquartile range in coverage was 11.51x, nearly five times the Utilities spread of 2.32x. Financially, this means the sector contains both highly resilient firms and materially weaker tail cases; the median alone understates issuer-specific risk.</w:t>
+      </w:r>
+    </w:p>
+    <w:p>
+      <w:pPr>
+        <w:spacing w:after="120" w:line="264" w:lineRule="auto"/>
+      </w:pPr>
+      <w:r>
+        <w:rPr>
+          <w:rFonts w:ascii="Calibri" w:hAnsi="Calibri"/>
+          <w:b/>
+          <w:i w:val="0"/>
+          <w:color w:val="17365D"/>
+          <w:sz w:val="21"/>
+        </w:rPr>
+        <w:t>Utilities.</w:t>
+      </w:r>
+      <w:r>
+        <w:rPr>
+          <w:rFonts w:ascii="Calibri" w:hAnsi="Calibri"/>
+          <w:b w:val="0"/>
+          <w:i w:val="0"/>
+          <w:color w:val="202124"/>
+          <w:sz w:val="21"/>
+        </w:rPr>
+        <w:t xml:space="preserve"> The full-panel Utilities median was 1.81x interest coverage, a -4.00% free-cash-flow margin, and 33.69% debt-to-assets. Coverage was below 1.5x in 43.5% of observations and free cash flow was negative in 55.6%. These levels are consistent with a capital-intensive business model in which large infrastructure investment is frequently financed externally. Negative free cash flow is therefore not automatically evidence of distress. It becomes more informative when paired with falling coverage, rising leverage, weak liquidity, or an unfavorable refinancing environment. Utilities also had stronger clustering around their sector norms, so relatively small changes can matter even when their absolute ratios look less dispersed.</w:t>
+      </w:r>
+    </w:p>
+    <w:tbl>
+      <w:tblPr>
+        <w:tblStyle w:val="TableGrid"/>
+        <w:tblW w:type="dxa" w:w="9360"/>
+        <w:jc w:val="left"/>
+        <w:tblLayout w:type="fixed"/>
+        <w:tblLook w:firstColumn="1" w:firstRow="1" w:lastColumn="0" w:lastRow="0" w:noHBand="0" w:noVBand="1" w:val="04A0"/>
+        <w:tblInd w:w="120" w:type="dxa"/>
+      </w:tblPr>
+      <w:tblGrid>
+        <w:gridCol w:w="2100"/>
+        <w:gridCol w:w="1900"/>
+        <w:gridCol w:w="1500"/>
+        <w:gridCol w:w="3860"/>
+      </w:tblGrid>
+      <w:tr>
+        <w:tc>
+          <w:tcPr>
+            <w:tcW w:type="dxa" w:w="2100"/>
+            <w:shd w:fill="EAF1F8"/>
+            <w:vAlign w:val="center"/>
+            <w:tcMar>
+              <w:top w:w="80" w:type="dxa"/>
+              <w:bottom w:w="80" w:type="dxa"/>
+              <w:start w:w="120" w:type="dxa"/>
+              <w:end w:w="120" w:type="dxa"/>
+            </w:tcMar>
+          </w:tcPr>
+          <w:p>
+            <w:pPr>
+              <w:spacing w:after="0"/>
+            </w:pPr>
+            <w:r>
+              <w:rPr>
+                <w:rFonts w:ascii="Calibri" w:hAnsi="Calibri"/>
+                <w:b/>
+                <w:i w:val="0"/>
+                <w:color w:val="17365D"/>
+                <w:sz w:val="18"/>
+              </w:rPr>
+              <w:t>Exploratory indicator</w:t>
+            </w:r>
+          </w:p>
+        </w:tc>
+        <w:tc>
+          <w:tcPr>
+            <w:tcW w:type="dxa" w:w="1900"/>
+            <w:shd w:fill="EAF1F8"/>
+            <w:vAlign w:val="center"/>
+            <w:tcMar>
+              <w:top w:w="80" w:type="dxa"/>
+              <w:bottom w:w="80" w:type="dxa"/>
+              <w:start w:w="120" w:type="dxa"/>
+              <w:end w:w="120" w:type="dxa"/>
+            </w:tcMar>
+          </w:tcPr>
+          <w:p>
+            <w:pPr>
+              <w:spacing w:after="0"/>
+            </w:pPr>
+            <w:r>
+              <w:rPr>
+                <w:rFonts w:ascii="Calibri" w:hAnsi="Calibri"/>
+                <w:b/>
+                <w:i w:val="0"/>
+                <w:color w:val="17365D"/>
+                <w:sz w:val="18"/>
+              </w:rPr>
+              <w:t>Consumer Discretionary</w:t>
+            </w:r>
+          </w:p>
+        </w:tc>
+        <w:tc>
+          <w:tcPr>
+            <w:tcW w:type="dxa" w:w="1500"/>
+            <w:shd w:fill="EAF1F8"/>
+            <w:vAlign w:val="center"/>
+            <w:tcMar>
+              <w:top w:w="80" w:type="dxa"/>
+              <w:bottom w:w="80" w:type="dxa"/>
+              <w:start w:w="120" w:type="dxa"/>
+              <w:end w:w="120" w:type="dxa"/>
+            </w:tcMar>
+          </w:tcPr>
+          <w:p>
+            <w:pPr>
+              <w:spacing w:after="0"/>
+            </w:pPr>
+            <w:r>
+              <w:rPr>
+                <w:rFonts w:ascii="Calibri" w:hAnsi="Calibri"/>
+                <w:b/>
+                <w:i w:val="0"/>
+                <w:color w:val="17365D"/>
+                <w:sz w:val="18"/>
+              </w:rPr>
+              <w:t>Utilities</w:t>
+            </w:r>
+          </w:p>
+        </w:tc>
+        <w:tc>
+          <w:tcPr>
+            <w:tcW w:type="dxa" w:w="3860"/>
+            <w:shd w:fill="EAF1F8"/>
+            <w:vAlign w:val="center"/>
+            <w:tcMar>
+              <w:top w:w="80" w:type="dxa"/>
+              <w:bottom w:w="80" w:type="dxa"/>
+              <w:start w:w="120" w:type="dxa"/>
+              <w:end w:w="120" w:type="dxa"/>
+            </w:tcMar>
+          </w:tcPr>
+          <w:p>
+            <w:pPr>
+              <w:spacing w:after="0"/>
+            </w:pPr>
+            <w:r>
+              <w:rPr>
+                <w:rFonts w:ascii="Calibri" w:hAnsi="Calibri"/>
+                <w:b/>
+                <w:i w:val="0"/>
+                <w:color w:val="17365D"/>
+                <w:sz w:val="18"/>
+              </w:rPr>
+              <w:t>Financial reading</w:t>
+            </w:r>
+          </w:p>
+        </w:tc>
+      </w:tr>
+      <w:tr>
+        <w:tc>
+          <w:tcPr>
+            <w:tcW w:type="dxa" w:w="2100"/>
+            <w:vAlign w:val="center"/>
+            <w:tcMar>
+              <w:top w:w="80" w:type="dxa"/>
+              <w:bottom w:w="80" w:type="dxa"/>
+              <w:start w:w="120" w:type="dxa"/>
+              <w:end w:w="120" w:type="dxa"/>
+            </w:tcMar>
+          </w:tcPr>
+          <w:p>
+            <w:pPr>
+              <w:spacing w:after="0"/>
+            </w:pPr>
+            <w:r>
+              <w:rPr>
+                <w:rFonts w:ascii="Calibri" w:hAnsi="Calibri"/>
+                <w:b w:val="0"/>
+                <w:i w:val="0"/>
+                <w:color w:val="202124"/>
+                <w:sz w:val="17"/>
+              </w:rPr>
+              <w:t>Median interest coverage</w:t>
+            </w:r>
+          </w:p>
+        </w:tc>
+        <w:tc>
+          <w:tcPr>
+            <w:tcW w:type="dxa" w:w="1900"/>
+            <w:vAlign w:val="center"/>
+            <w:tcMar>
+              <w:top w:w="80" w:type="dxa"/>
+              <w:bottom w:w="80" w:type="dxa"/>
+              <w:start w:w="120" w:type="dxa"/>
+              <w:end w:w="120" w:type="dxa"/>
+            </w:tcMar>
+          </w:tcPr>
+          <w:p>
+            <w:pPr>
+              <w:spacing w:after="0"/>
+            </w:pPr>
+            <w:r>
+              <w:rPr>
+                <w:rFonts w:ascii="Calibri" w:hAnsi="Calibri"/>
+                <w:b w:val="0"/>
+                <w:i w:val="0"/>
+                <w:color w:val="202124"/>
+                <w:sz w:val="17"/>
+              </w:rPr>
+              <w:t>5.25x</w:t>
+            </w:r>
+          </w:p>
+        </w:tc>
+        <w:tc>
+          <w:tcPr>
+            <w:tcW w:type="dxa" w:w="1500"/>
+            <w:vAlign w:val="center"/>
+            <w:tcMar>
+              <w:top w:w="80" w:type="dxa"/>
+              <w:bottom w:w="80" w:type="dxa"/>
+              <w:start w:w="120" w:type="dxa"/>
+              <w:end w:w="120" w:type="dxa"/>
+            </w:tcMar>
+          </w:tcPr>
+          <w:p>
+            <w:pPr>
+              <w:spacing w:after="0"/>
+            </w:pPr>
+            <w:r>
+              <w:rPr>
+                <w:rFonts w:ascii="Calibri" w:hAnsi="Calibri"/>
+                <w:b w:val="0"/>
+                <w:i w:val="0"/>
+                <w:color w:val="202124"/>
+                <w:sz w:val="17"/>
+              </w:rPr>
+              <w:t>1.81x</w:t>
+            </w:r>
+          </w:p>
+        </w:tc>
+        <w:tc>
+          <w:tcPr>
+            <w:tcW w:type="dxa" w:w="3860"/>
+            <w:vAlign w:val="center"/>
+            <w:tcMar>
+              <w:top w:w="80" w:type="dxa"/>
+              <w:bottom w:w="80" w:type="dxa"/>
+              <w:start w:w="120" w:type="dxa"/>
+              <w:end w:w="120" w:type="dxa"/>
+            </w:tcMar>
+          </w:tcPr>
+          <w:p>
+            <w:pPr>
+              <w:spacing w:after="0"/>
+            </w:pPr>
+            <w:r>
+              <w:rPr>
+                <w:rFonts w:ascii="Calibri" w:hAnsi="Calibri"/>
+                <w:b w:val="0"/>
+                <w:i w:val="0"/>
+                <w:color w:val="202124"/>
+                <w:sz w:val="17"/>
+              </w:rPr>
+              <w:t>Utilities operate with a thinner recurring debt-service cushion.</w:t>
+            </w:r>
+          </w:p>
+        </w:tc>
+      </w:tr>
+      <w:tr>
+        <w:tc>
+          <w:tcPr>
+            <w:tcW w:type="dxa" w:w="2100"/>
+            <w:vAlign w:val="center"/>
+            <w:tcMar>
+              <w:top w:w="80" w:type="dxa"/>
+              <w:bottom w:w="80" w:type="dxa"/>
+              <w:start w:w="120" w:type="dxa"/>
+              <w:end w:w="120" w:type="dxa"/>
+            </w:tcMar>
+          </w:tcPr>
+          <w:p>
+            <w:pPr>
+              <w:spacing w:after="0"/>
+            </w:pPr>
+            <w:r>
+              <w:rPr>
+                <w:rFonts w:ascii="Calibri" w:hAnsi="Calibri"/>
+                <w:b w:val="0"/>
+                <w:i w:val="0"/>
+                <w:color w:val="202124"/>
+                <w:sz w:val="17"/>
+              </w:rPr>
+              <w:t>Median FCF margin</w:t>
+            </w:r>
+          </w:p>
+        </w:tc>
+        <w:tc>
+          <w:tcPr>
+            <w:tcW w:type="dxa" w:w="1900"/>
+            <w:vAlign w:val="center"/>
+            <w:tcMar>
+              <w:top w:w="80" w:type="dxa"/>
+              <w:bottom w:w="80" w:type="dxa"/>
+              <w:start w:w="120" w:type="dxa"/>
+              <w:end w:w="120" w:type="dxa"/>
+            </w:tcMar>
+          </w:tcPr>
+          <w:p>
+            <w:pPr>
+              <w:spacing w:after="0"/>
+            </w:pPr>
+            <w:r>
+              <w:rPr>
+                <w:rFonts w:ascii="Calibri" w:hAnsi="Calibri"/>
+                <w:b w:val="0"/>
+                <w:i w:val="0"/>
+                <w:color w:val="202124"/>
+                <w:sz w:val="17"/>
+              </w:rPr>
+              <w:t>10.12%</w:t>
+            </w:r>
+          </w:p>
+        </w:tc>
+        <w:tc>
+          <w:tcPr>
+            <w:tcW w:type="dxa" w:w="1500"/>
+            <w:vAlign w:val="center"/>
+            <w:tcMar>
+              <w:top w:w="80" w:type="dxa"/>
+              <w:bottom w:w="80" w:type="dxa"/>
+              <w:start w:w="120" w:type="dxa"/>
+              <w:end w:w="120" w:type="dxa"/>
+            </w:tcMar>
+          </w:tcPr>
+          <w:p>
+            <w:pPr>
+              <w:spacing w:after="0"/>
+            </w:pPr>
+            <w:r>
+              <w:rPr>
+                <w:rFonts w:ascii="Calibri" w:hAnsi="Calibri"/>
+                <w:b w:val="0"/>
+                <w:i w:val="0"/>
+                <w:color w:val="202124"/>
+                <w:sz w:val="17"/>
+              </w:rPr>
+              <w:t>-4.00%</w:t>
+            </w:r>
+          </w:p>
+        </w:tc>
+        <w:tc>
+          <w:tcPr>
+            <w:tcW w:type="dxa" w:w="3860"/>
+            <w:vAlign w:val="center"/>
+            <w:tcMar>
+              <w:top w:w="80" w:type="dxa"/>
+              <w:bottom w:w="80" w:type="dxa"/>
+              <w:start w:w="120" w:type="dxa"/>
+              <w:end w:w="120" w:type="dxa"/>
+            </w:tcMar>
+          </w:tcPr>
+          <w:p>
+            <w:pPr>
+              <w:spacing w:after="0"/>
+            </w:pPr>
+            <w:r>
+              <w:rPr>
+                <w:rFonts w:ascii="Calibri" w:hAnsi="Calibri"/>
+                <w:b w:val="0"/>
+                <w:i w:val="0"/>
+                <w:color w:val="202124"/>
+                <w:sz w:val="17"/>
+              </w:rPr>
+              <w:t>Utility capital spending often exceeds internally generated cash.</w:t>
+            </w:r>
+          </w:p>
+        </w:tc>
+      </w:tr>
+      <w:tr>
+        <w:tc>
+          <w:tcPr>
+            <w:tcW w:type="dxa" w:w="2100"/>
+            <w:vAlign w:val="center"/>
+            <w:tcMar>
+              <w:top w:w="80" w:type="dxa"/>
+              <w:bottom w:w="80" w:type="dxa"/>
+              <w:start w:w="120" w:type="dxa"/>
+              <w:end w:w="120" w:type="dxa"/>
+            </w:tcMar>
+          </w:tcPr>
+          <w:p>
+            <w:pPr>
+              <w:spacing w:after="0"/>
+            </w:pPr>
+            <w:r>
+              <w:rPr>
+                <w:rFonts w:ascii="Calibri" w:hAnsi="Calibri"/>
+                <w:b w:val="0"/>
+                <w:i w:val="0"/>
+                <w:color w:val="202124"/>
+                <w:sz w:val="17"/>
+              </w:rPr>
+              <w:t>Median debt/assets</w:t>
+            </w:r>
+          </w:p>
+        </w:tc>
+        <w:tc>
+          <w:tcPr>
+            <w:tcW w:type="dxa" w:w="1900"/>
+            <w:vAlign w:val="center"/>
+            <w:tcMar>
+              <w:top w:w="80" w:type="dxa"/>
+              <w:bottom w:w="80" w:type="dxa"/>
+              <w:start w:w="120" w:type="dxa"/>
+              <w:end w:w="120" w:type="dxa"/>
+            </w:tcMar>
+          </w:tcPr>
+          <w:p>
+            <w:pPr>
+              <w:spacing w:after="0"/>
+            </w:pPr>
+            <w:r>
+              <w:rPr>
+                <w:rFonts w:ascii="Calibri" w:hAnsi="Calibri"/>
+                <w:b w:val="0"/>
+                <w:i w:val="0"/>
+                <w:color w:val="202124"/>
+                <w:sz w:val="17"/>
+              </w:rPr>
+              <w:t>22.00%</w:t>
+            </w:r>
+          </w:p>
+        </w:tc>
+        <w:tc>
+          <w:tcPr>
+            <w:tcW w:type="dxa" w:w="1500"/>
+            <w:vAlign w:val="center"/>
+            <w:tcMar>
+              <w:top w:w="80" w:type="dxa"/>
+              <w:bottom w:w="80" w:type="dxa"/>
+              <w:start w:w="120" w:type="dxa"/>
+              <w:end w:w="120" w:type="dxa"/>
+            </w:tcMar>
+          </w:tcPr>
+          <w:p>
+            <w:pPr>
+              <w:spacing w:after="0"/>
+            </w:pPr>
+            <w:r>
+              <w:rPr>
+                <w:rFonts w:ascii="Calibri" w:hAnsi="Calibri"/>
+                <w:b w:val="0"/>
+                <w:i w:val="0"/>
+                <w:color w:val="202124"/>
+                <w:sz w:val="17"/>
+              </w:rPr>
+              <w:t>33.69%</w:t>
+            </w:r>
+          </w:p>
+        </w:tc>
+        <w:tc>
+          <w:tcPr>
+            <w:tcW w:type="dxa" w:w="3860"/>
+            <w:vAlign w:val="center"/>
+            <w:tcMar>
+              <w:top w:w="80" w:type="dxa"/>
+              <w:bottom w:w="80" w:type="dxa"/>
+              <w:start w:w="120" w:type="dxa"/>
+              <w:end w:w="120" w:type="dxa"/>
+            </w:tcMar>
+          </w:tcPr>
+          <w:p>
+            <w:pPr>
+              <w:spacing w:after="0"/>
+            </w:pPr>
+            <w:r>
+              <w:rPr>
+                <w:rFonts w:ascii="Calibri" w:hAnsi="Calibri"/>
+                <w:b w:val="0"/>
+                <w:i w:val="0"/>
+                <w:color w:val="202124"/>
+                <w:sz w:val="17"/>
+              </w:rPr>
+              <w:t>The regulated asset base generally supports more structural leverage.</w:t>
+            </w:r>
+          </w:p>
+        </w:tc>
+      </w:tr>
+      <w:tr>
+        <w:tc>
+          <w:tcPr>
+            <w:tcW w:type="dxa" w:w="2100"/>
+            <w:vAlign w:val="center"/>
+            <w:tcMar>
+              <w:top w:w="80" w:type="dxa"/>
+              <w:bottom w:w="80" w:type="dxa"/>
+              <w:start w:w="120" w:type="dxa"/>
+              <w:end w:w="120" w:type="dxa"/>
+            </w:tcMar>
+          </w:tcPr>
+          <w:p>
+            <w:pPr>
+              <w:spacing w:after="0"/>
+            </w:pPr>
+            <w:r>
+              <w:rPr>
+                <w:rFonts w:ascii="Calibri" w:hAnsi="Calibri"/>
+                <w:b w:val="0"/>
+                <w:i w:val="0"/>
+                <w:color w:val="202124"/>
+                <w:sz w:val="17"/>
+              </w:rPr>
+              <w:t>Coverage below 1.5x</w:t>
+            </w:r>
+          </w:p>
+        </w:tc>
+        <w:tc>
+          <w:tcPr>
+            <w:tcW w:type="dxa" w:w="1900"/>
+            <w:vAlign w:val="center"/>
+            <w:tcMar>
+              <w:top w:w="80" w:type="dxa"/>
+              <w:bottom w:w="80" w:type="dxa"/>
+              <w:start w:w="120" w:type="dxa"/>
+              <w:end w:w="120" w:type="dxa"/>
+            </w:tcMar>
+          </w:tcPr>
+          <w:p>
+            <w:pPr>
+              <w:spacing w:after="0"/>
+            </w:pPr>
+            <w:r>
+              <w:rPr>
+                <w:rFonts w:ascii="Calibri" w:hAnsi="Calibri"/>
+                <w:b w:val="0"/>
+                <w:i w:val="0"/>
+                <w:color w:val="202124"/>
+                <w:sz w:val="17"/>
+              </w:rPr>
+              <w:t>22.5%</w:t>
+            </w:r>
+          </w:p>
+        </w:tc>
+        <w:tc>
+          <w:tcPr>
+            <w:tcW w:type="dxa" w:w="1500"/>
+            <w:vAlign w:val="center"/>
+            <w:tcMar>
+              <w:top w:w="80" w:type="dxa"/>
+              <w:bottom w:w="80" w:type="dxa"/>
+              <w:start w:w="120" w:type="dxa"/>
+              <w:end w:w="120" w:type="dxa"/>
+            </w:tcMar>
+          </w:tcPr>
+          <w:p>
+            <w:pPr>
+              <w:spacing w:after="0"/>
+            </w:pPr>
+            <w:r>
+              <w:rPr>
+                <w:rFonts w:ascii="Calibri" w:hAnsi="Calibri"/>
+                <w:b w:val="0"/>
+                <w:i w:val="0"/>
+                <w:color w:val="202124"/>
+                <w:sz w:val="17"/>
+              </w:rPr>
+              <w:t>43.5%</w:t>
+            </w:r>
+          </w:p>
+        </w:tc>
+        <w:tc>
+          <w:tcPr>
+            <w:tcW w:type="dxa" w:w="3860"/>
+            <w:vAlign w:val="center"/>
+            <w:tcMar>
+              <w:top w:w="80" w:type="dxa"/>
+              <w:bottom w:w="80" w:type="dxa"/>
+              <w:start w:w="120" w:type="dxa"/>
+              <w:end w:w="120" w:type="dxa"/>
+            </w:tcMar>
+          </w:tcPr>
+          <w:p>
+            <w:pPr>
+              <w:spacing w:after="0"/>
+            </w:pPr>
+            <w:r>
+              <w:rPr>
+                <w:rFonts w:ascii="Calibri" w:hAnsi="Calibri"/>
+                <w:b w:val="0"/>
+                <w:i w:val="0"/>
+                <w:color w:val="202124"/>
+                <w:sz w:val="17"/>
+              </w:rPr>
+              <w:t>A common absolute threshold carries different base rates by sector.</w:t>
+            </w:r>
+          </w:p>
+        </w:tc>
+      </w:tr>
+      <w:tr>
+        <w:tc>
+          <w:tcPr>
+            <w:tcW w:type="dxa" w:w="2100"/>
+            <w:vAlign w:val="center"/>
+            <w:tcMar>
+              <w:top w:w="80" w:type="dxa"/>
+              <w:bottom w:w="80" w:type="dxa"/>
+              <w:start w:w="120" w:type="dxa"/>
+              <w:end w:w="120" w:type="dxa"/>
+            </w:tcMar>
+          </w:tcPr>
+          <w:p>
+            <w:pPr>
+              <w:spacing w:after="0"/>
+            </w:pPr>
+            <w:r>
+              <w:rPr>
+                <w:rFonts w:ascii="Calibri" w:hAnsi="Calibri"/>
+                <w:b w:val="0"/>
+                <w:i w:val="0"/>
+                <w:color w:val="202124"/>
+                <w:sz w:val="17"/>
+              </w:rPr>
+              <w:t>Negative FCF margin</w:t>
+            </w:r>
+          </w:p>
+        </w:tc>
+        <w:tc>
+          <w:tcPr>
+            <w:tcW w:type="dxa" w:w="1900"/>
+            <w:vAlign w:val="center"/>
+            <w:tcMar>
+              <w:top w:w="80" w:type="dxa"/>
+              <w:bottom w:w="80" w:type="dxa"/>
+              <w:start w:w="120" w:type="dxa"/>
+              <w:end w:w="120" w:type="dxa"/>
+            </w:tcMar>
+          </w:tcPr>
+          <w:p>
+            <w:pPr>
+              <w:spacing w:after="0"/>
+            </w:pPr>
+            <w:r>
+              <w:rPr>
+                <w:rFonts w:ascii="Calibri" w:hAnsi="Calibri"/>
+                <w:b w:val="0"/>
+                <w:i w:val="0"/>
+                <w:color w:val="202124"/>
+                <w:sz w:val="17"/>
+              </w:rPr>
+              <w:t>16.4%</w:t>
+            </w:r>
+          </w:p>
+        </w:tc>
+        <w:tc>
+          <w:tcPr>
+            <w:tcW w:type="dxa" w:w="1500"/>
+            <w:vAlign w:val="center"/>
+            <w:tcMar>
+              <w:top w:w="80" w:type="dxa"/>
+              <w:bottom w:w="80" w:type="dxa"/>
+              <w:start w:w="120" w:type="dxa"/>
+              <w:end w:w="120" w:type="dxa"/>
+            </w:tcMar>
+          </w:tcPr>
+          <w:p>
+            <w:pPr>
+              <w:spacing w:after="0"/>
+            </w:pPr>
+            <w:r>
+              <w:rPr>
+                <w:rFonts w:ascii="Calibri" w:hAnsi="Calibri"/>
+                <w:b w:val="0"/>
+                <w:i w:val="0"/>
+                <w:color w:val="202124"/>
+                <w:sz w:val="17"/>
+              </w:rPr>
+              <w:t>55.6%</w:t>
+            </w:r>
+          </w:p>
+        </w:tc>
+        <w:tc>
+          <w:tcPr>
+            <w:tcW w:type="dxa" w:w="3860"/>
+            <w:vAlign w:val="center"/>
+            <w:tcMar>
+              <w:top w:w="80" w:type="dxa"/>
+              <w:bottom w:w="80" w:type="dxa"/>
+              <w:start w:w="120" w:type="dxa"/>
+              <w:end w:w="120" w:type="dxa"/>
+            </w:tcMar>
+          </w:tcPr>
+          <w:p>
+            <w:pPr>
+              <w:spacing w:after="0"/>
+            </w:pPr>
+            <w:r>
+              <w:rPr>
+                <w:rFonts w:ascii="Calibri" w:hAnsi="Calibri"/>
+                <w:b w:val="0"/>
+                <w:i w:val="0"/>
+                <w:color w:val="202124"/>
+                <w:sz w:val="17"/>
+              </w:rPr>
+              <w:t>Cash deficits require operating and capital-expenditure context.</w:t>
+            </w:r>
+          </w:p>
+        </w:tc>
+      </w:tr>
+      <w:tr>
+        <w:tc>
+          <w:tcPr>
+            <w:tcW w:type="dxa" w:w="2100"/>
+            <w:vAlign w:val="center"/>
+            <w:tcMar>
+              <w:top w:w="80" w:type="dxa"/>
+              <w:bottom w:w="80" w:type="dxa"/>
+              <w:start w:w="120" w:type="dxa"/>
+              <w:end w:w="120" w:type="dxa"/>
+            </w:tcMar>
+          </w:tcPr>
+          <w:p>
+            <w:pPr>
+              <w:spacing w:after="0"/>
+            </w:pPr>
+            <w:r>
+              <w:rPr>
+                <w:rFonts w:ascii="Calibri" w:hAnsi="Calibri"/>
+                <w:b w:val="0"/>
+                <w:i w:val="0"/>
+                <w:color w:val="202124"/>
+                <w:sz w:val="17"/>
+              </w:rPr>
+              <w:t>Observed deterioration label</w:t>
+            </w:r>
+          </w:p>
+        </w:tc>
+        <w:tc>
+          <w:tcPr>
+            <w:tcW w:type="dxa" w:w="1900"/>
+            <w:vAlign w:val="center"/>
+            <w:tcMar>
+              <w:top w:w="80" w:type="dxa"/>
+              <w:bottom w:w="80" w:type="dxa"/>
+              <w:start w:w="120" w:type="dxa"/>
+              <w:end w:w="120" w:type="dxa"/>
+            </w:tcMar>
+          </w:tcPr>
+          <w:p>
+            <w:pPr>
+              <w:spacing w:after="0"/>
+            </w:pPr>
+            <w:r>
+              <w:rPr>
+                <w:rFonts w:ascii="Calibri" w:hAnsi="Calibri"/>
+                <w:b w:val="0"/>
+                <w:i w:val="0"/>
+                <w:color w:val="202124"/>
+                <w:sz w:val="17"/>
+              </w:rPr>
+              <w:t>22.2%</w:t>
+            </w:r>
+          </w:p>
+        </w:tc>
+        <w:tc>
+          <w:tcPr>
+            <w:tcW w:type="dxa" w:w="1500"/>
+            <w:vAlign w:val="center"/>
+            <w:tcMar>
+              <w:top w:w="80" w:type="dxa"/>
+              <w:bottom w:w="80" w:type="dxa"/>
+              <w:start w:w="120" w:type="dxa"/>
+              <w:end w:w="120" w:type="dxa"/>
+            </w:tcMar>
+          </w:tcPr>
+          <w:p>
+            <w:pPr>
+              <w:spacing w:after="0"/>
+            </w:pPr>
+            <w:r>
+              <w:rPr>
+                <w:rFonts w:ascii="Calibri" w:hAnsi="Calibri"/>
+                <w:b w:val="0"/>
+                <w:i w:val="0"/>
+                <w:color w:val="202124"/>
+                <w:sz w:val="17"/>
+              </w:rPr>
+              <w:t>20.7%</w:t>
+            </w:r>
+          </w:p>
+        </w:tc>
+        <w:tc>
+          <w:tcPr>
+            <w:tcW w:type="dxa" w:w="3860"/>
+            <w:vAlign w:val="center"/>
+            <w:tcMar>
+              <w:top w:w="80" w:type="dxa"/>
+              <w:bottom w:w="80" w:type="dxa"/>
+              <w:start w:w="120" w:type="dxa"/>
+              <w:end w:w="120" w:type="dxa"/>
+            </w:tcMar>
+          </w:tcPr>
+          <w:p>
+            <w:pPr>
+              <w:spacing w:after="0"/>
+            </w:pPr>
+            <w:r>
+              <w:rPr>
+                <w:rFonts w:ascii="Calibri" w:hAnsi="Calibri"/>
+                <w:b w:val="0"/>
+                <w:i w:val="0"/>
+                <w:color w:val="202124"/>
+                <w:sz w:val="17"/>
+              </w:rPr>
+              <w:t>Similar event rates arise from different financial structures.</w:t>
+            </w:r>
+          </w:p>
+        </w:tc>
+      </w:tr>
+    </w:tbl>
+    <w:p>
+      <w:pPr>
+        <w:spacing w:after="0"/>
+      </w:pPr>
+    </w:p>
+    <w:p>
+      <w:pPr>
+        <w:pStyle w:val="Heading2"/>
+        <w:keepNext/>
+      </w:pPr>
+      <w:r>
+        <w:rPr>
+          <w:rFonts w:ascii="Calibri" w:hAnsi="Calibri"/>
+          <w:b/>
+          <w:i w:val="0"/>
+          <w:color w:val="17365D"/>
+          <w:sz w:val="26"/>
+        </w:rPr>
+        <w:t>4.2 Time-series and regime findings</w:t>
+      </w:r>
+    </w:p>
+    <w:p>
+      <w:pPr>
+        <w:keepNext/>
+        <w:jc w:val="center"/>
+      </w:pPr>
+      <w:r>
+        <w:drawing>
+          <wp:inline xmlns:a="http://schemas.openxmlformats.org/drawingml/2006/main" xmlns:pic="http://schemas.openxmlformats.org/drawingml/2006/picture">
+            <wp:extent cx="5760720" cy="4800600"/>
+            <wp:docPr id="3" name="Picture 3"/>
+            <wp:cNvGraphicFramePr>
+              <a:graphicFrameLocks noChangeAspect="1"/>
+            </wp:cNvGraphicFramePr>
+            <a:graphic>
+              <a:graphicData uri="http://schemas.openxmlformats.org/drawingml/2006/picture">
+                <pic:pic>
+                  <pic:nvPicPr>
+                    <pic:cNvPr id="0" name="sector_kpi_time_series.png"/>
+                    <pic:cNvPicPr/>
+                  </pic:nvPicPr>
+                  <pic:blipFill>
+                    <a:blip r:embed="rId13"/>
+                    <a:stretch>
+                      <a:fillRect/>
+                    </a:stretch>
+                  </pic:blipFill>
+                  <pic:spPr>
+                    <a:xfrm>
+                      <a:off x="0" y="0"/>
+                      <a:ext cx="5760720" cy="4800600"/>
+                    </a:xfrm>
+                    <a:prstGeom prst="rect"/>
+                  </pic:spPr>
+                </pic:pic>
+              </a:graphicData>
+            </a:graphic>
+          </wp:inline>
+        </w:drawing>
+      </w:r>
+    </w:p>
+    <w:p>
+      <w:pPr>
+        <w:spacing w:after="160"/>
+        <w:jc w:val="center"/>
+      </w:pPr>
+      <w:r>
+        <w:rPr>
+          <w:rFonts w:ascii="Calibri" w:hAnsi="Calibri"/>
+          <w:b w:val="0"/>
+          <w:i/>
+          <w:color w:val="667085"/>
+          <w:sz w:val="17"/>
+        </w:rPr>
+        <w:t>Figure 3. Annual medians summarize sector conditions; they do not imply that every issuer followed the median path.</w:t>
+      </w:r>
+    </w:p>
+    <w:p>
+      <w:pPr>
+        <w:spacing w:after="120" w:line="264" w:lineRule="auto"/>
+      </w:pPr>
+      <w:r>
+        <w:rPr>
+          <w:rFonts w:ascii="Calibri" w:hAnsi="Calibri"/>
+          <w:b/>
+          <w:i w:val="0"/>
+          <w:color w:val="17365D"/>
+          <w:sz w:val="21"/>
+        </w:rPr>
+        <w:t>Consumer Discretionary trajectory.</w:t>
+      </w:r>
+      <w:r>
+        <w:rPr>
+          <w:rFonts w:ascii="Calibri" w:hAnsi="Calibri"/>
+          <w:b w:val="0"/>
+          <w:i w:val="0"/>
+          <w:color w:val="202124"/>
+          <w:sz w:val="21"/>
+        </w:rPr>
+        <w:t xml:space="preserve"> Median coverage declined from 5.42x in fiscal 2012 to 3.57x in 2019, then recovered sharply and peaked at 9.19x in 2022 before moderating to 6.34x in 2024. That improvement did not translate into equally strong cash conversion: median free-cash-flow margin fell from 18.6% in 2019 to 6.0% in 2024, while debt-to-assets rose into 2021–2022 and then eased. The combined reading is more nuanced than the coverage line alone. Post-pandemic earnings recovery strengthened the ability to pay interest, but weakening cash conversion and still-elevated leverage indicate less balance-sheet flexibility than the coverage peak suggests. The deterioration-label rate was 29.3% in 2020–2021 versus 22.7% in 2017–2019, consistent with greater cyclical exposure and uneven issuer recovery.</w:t>
+      </w:r>
+    </w:p>
+    <w:p>
+      <w:pPr>
+        <w:spacing w:after="120" w:line="264" w:lineRule="auto"/>
+      </w:pPr>
+      <w:r>
+        <w:rPr>
+          <w:rFonts w:ascii="Calibri" w:hAnsi="Calibri"/>
+          <w:b/>
+          <w:i w:val="0"/>
+          <w:color w:val="17365D"/>
+          <w:sz w:val="21"/>
+        </w:rPr>
+        <w:t>Utilities trajectory.</w:t>
+      </w:r>
+      <w:r>
+        <w:rPr>
+          <w:rFonts w:ascii="Calibri" w:hAnsi="Calibri"/>
+          <w:b w:val="0"/>
+          <w:i w:val="0"/>
+          <w:color w:val="202124"/>
+          <w:sz w:val="21"/>
+        </w:rPr>
+        <w:t xml:space="preserve"> Median coverage rose from 0.85x in 2019 to 3.04x in 2023, then eased to 2.73x in 2024. At the same time, free-cash-flow margin deteriorated from -2.7% to -12.4%, and debt-to-assets increased from 32.1% to 38.9%. The sector therefore shows improving accounting coverage alongside a growing financing requirement. This divergence can occur when operating earnings improve but sustained capital expenditure and debt-funded investment absorb cash. For surveillance, the relevant question is not whether one ratio is good or bad in isolation, but whether earnings, cash generation, leverage, and funding costs remain mutually supportable.</w:t>
+      </w:r>
+    </w:p>
+    <w:p>
+      <w:pPr>
+        <w:spacing w:after="120" w:line="264" w:lineRule="auto"/>
+      </w:pPr>
+      <w:r>
+        <w:rPr>
+          <w:rFonts w:ascii="Calibri" w:hAnsi="Calibri"/>
+          <w:b/>
+          <w:i w:val="0"/>
+          <w:color w:val="17365D"/>
+          <w:sz w:val="21"/>
+        </w:rPr>
+        <w:t>Event interpretation.</w:t>
+      </w:r>
+      <w:r>
+        <w:rPr>
+          <w:rFonts w:ascii="Calibri" w:hAnsi="Calibri"/>
+          <w:b w:val="0"/>
+          <w:i w:val="0"/>
+          <w:color w:val="202124"/>
+          <w:sz w:val="21"/>
+        </w:rPr>
+        <w:t xml:space="preserve"> Consumer Discretionary recorded 92 distinct deterioration episode starts, compared with 101 for Utilities, despite similar row-level label prevalence. Utilities therefore experienced slightly more separate transitions into deterioration, while Consumer Discretionary showed more pronounced regime sensitivity. Because the label requires both sub-1.5x coverage and a 40% decline, higher recent Utility coverage mechanically reduced the recent event rate even as free cash flow and leverage weakened. This is an important limitation of any single outcome definition and supports monitoring the component KPIs alongside the model probability.</w:t>
+      </w:r>
+    </w:p>
+    <w:p>
+      <w:pPr>
+        <w:pStyle w:val="Heading2"/>
+        <w:keepNext/>
+      </w:pPr>
+      <w:r>
+        <w:rPr>
+          <w:rFonts w:ascii="Calibri" w:hAnsi="Calibri"/>
+          <w:b/>
+          <w:i w:val="0"/>
+          <w:color w:val="17365D"/>
+          <w:sz w:val="26"/>
+        </w:rPr>
+        <w:t>4.3 Fiscal-quarter patterns and persistence</w:t>
+      </w:r>
+    </w:p>
+    <w:p>
+      <w:pPr>
+        <w:keepNext/>
+        <w:jc w:val="center"/>
+      </w:pPr>
+      <w:r>
+        <w:drawing>
+          <wp:inline xmlns:a="http://schemas.openxmlformats.org/drawingml/2006/main" xmlns:pic="http://schemas.openxmlformats.org/drawingml/2006/picture">
+            <wp:extent cx="5760720" cy="2263140"/>
+            <wp:docPr id="4" name="Picture 4"/>
+            <wp:cNvGraphicFramePr>
+              <a:graphicFrameLocks noChangeAspect="1"/>
+            </wp:cNvGraphicFramePr>
+            <a:graphic>
+              <a:graphicData uri="http://schemas.openxmlformats.org/drawingml/2006/picture">
+                <pic:pic>
+                  <pic:nvPicPr>
+                    <pic:cNvPr id="0" name="sector_kpi_fiscal_quarter.png"/>
+                    <pic:cNvPicPr/>
+                  </pic:nvPicPr>
+                  <pic:blipFill>
+                    <a:blip r:embed="rId14"/>
+                    <a:stretch>
+                      <a:fillRect/>
+                    </a:stretch>
+                  </pic:blipFill>
+                  <pic:spPr>
+                    <a:xfrm>
+                      <a:off x="0" y="0"/>
+                      <a:ext cx="5760720" cy="2263140"/>
+                    </a:xfrm>
+                    <a:prstGeom prst="rect"/>
+                  </pic:spPr>
+                </pic:pic>
+              </a:graphicData>
+            </a:graphic>
+          </wp:inline>
+        </w:drawing>
+      </w:r>
+    </w:p>
+    <w:p>
+      <w:pPr>
+        <w:spacing w:after="160"/>
+        <w:jc w:val="center"/>
+      </w:pPr>
+      <w:r>
+        <w:rPr>
+          <w:rFonts w:ascii="Calibri" w:hAnsi="Calibri"/>
+          <w:b w:val="0"/>
+          <w:i/>
+          <w:color w:val="667085"/>
+          <w:sz w:val="17"/>
+        </w:rPr>
+        <w:t>Figure 4. Standardized fiscal-quarter medians. Trailing-twelve-month construction intentionally smooths quarter-specific noise.</w:t>
+      </w:r>
+    </w:p>
+    <w:p>
+      <w:pPr>
+        <w:spacing w:after="120" w:line="264" w:lineRule="auto"/>
+      </w:pPr>
+      <w:r>
+        <w:rPr>
+          <w:rFonts w:ascii="Calibri" w:hAnsi="Calibri"/>
+          <w:b w:val="0"/>
+          <w:i w:val="0"/>
+          <w:color w:val="202124"/>
+          <w:sz w:val="21"/>
+        </w:rPr>
+        <w:t>There is little evidence of strong recurring seasonality in the three central KPIs. Consumer Discretionary coverage ranges only from 4.98x to 5.27x across FQ1–FQ4, free-cash-flow margin from 9.1% to 11.3%, and debt-to-assets from 21.7% to 22.4%. Utilities are even steadier: coverage ranges from 1.79x to 1.84x, free-cash-flow margin from -4.2% to -3.8%, and leverage from 33.4% to 34.0%. The modest Consumer Discretionary FQ4 cash-flow decline may reflect working-capital timing or issuer mix, but it is too small to treat as a reliable seasonal trading signal without company-level testing.</w:t>
+      </w:r>
+    </w:p>
+    <w:p>
+      <w:pPr>
+        <w:spacing w:after="120" w:line="264" w:lineRule="auto"/>
+      </w:pPr>
+      <w:r>
+        <w:rPr>
+          <w:rFonts w:ascii="Calibri" w:hAnsi="Calibri"/>
+          <w:b/>
+          <w:i w:val="0"/>
+          <w:color w:val="17365D"/>
+          <w:sz w:val="21"/>
+        </w:rPr>
+        <w:t>Methodological implication.</w:t>
+      </w:r>
+      <w:r>
+        <w:rPr>
+          <w:rFonts w:ascii="Calibri" w:hAnsi="Calibri"/>
+          <w:b w:val="0"/>
+          <w:i w:val="0"/>
+          <w:color w:val="202124"/>
+          <w:sz w:val="21"/>
+        </w:rPr>
+        <w:t xml:space="preserve"> The weak quarter pattern is expected because the ratios use trailing-twelve-month values, which combine four quarters and reduce seasonal noise. The stronger empirical feature is persistence: recent KPI levels contain substantial information about the next quarter. This explains why a random-walk forecast was difficult to beat for one-quarter cash-flow margin and coverage, while a local-level model was more suitable for gradual leverage changes and four-quarter horizons. Sector-specific baselines, changes from each company's own history, and macro conditions are therefore more defensible than broad seasonal adjustments.</w:t>
+      </w:r>
+    </w:p>
+    <w:p>
+      <w:pPr>
+        <w:pStyle w:val="Heading1"/>
+        <w:keepNext/>
+      </w:pPr>
+      <w:r>
+        <w:rPr>
+          <w:rFonts w:ascii="Calibri" w:hAnsi="Calibri"/>
+          <w:b/>
+          <w:i w:val="0"/>
+          <w:color w:val="17365D"/>
+          <w:sz w:val="32"/>
+        </w:rPr>
+        <w:t>5. Forecasting methodology: matching model structure to temporal financial data</w:t>
       </w:r>
     </w:p>
     <w:p>
@@ -1807,7 +2943,7 @@
                 <w:color w:val="202124"/>
                 <w:sz w:val="17"/>
               </w:rPr>
-              <w:t>Treats the latent financial condition as evolving with measurement noise.</w:t>
+              <w:t>Estimates an underlying financial level while allowing quarterly reporting noise.</w:t>
             </w:r>
           </w:p>
         </w:tc>
@@ -1834,7 +2970,7 @@
                 <w:color w:val="202124"/>
                 <w:sz w:val="17"/>
               </w:rPr>
-              <w:t>Robust structural model for noisy quarterly ratios; prespecified source of forecast features.</w:t>
+              <w:t>Useful for noisy ratios when the company's true condition changes gradually.</w:t>
             </w:r>
           </w:p>
         </w:tc>
@@ -1890,7 +3026,7 @@
                 <w:color w:val="202124"/>
                 <w:sz w:val="17"/>
               </w:rPr>
-              <w:t>Allows both level and slope to evolve.</w:t>
+              <w:t>Allows both the financial level and its direction of change to move over time.</w:t>
             </w:r>
           </w:p>
         </w:tc>
@@ -1917,7 +3053,7 @@
                 <w:color w:val="202124"/>
                 <w:sz w:val="17"/>
               </w:rPr>
-              <w:t>Appropriate when operating or leverage trajectories change gradually, but can be unstable in short histories.</w:t>
+              <w:t>Useful for gradual operating or leverage trends, but can be unstable with short histories.</w:t>
             </w:r>
           </w:p>
         </w:tc>
@@ -1946,7 +3082,7 @@
                 <w:color w:val="202124"/>
                 <w:sz w:val="17"/>
               </w:rPr>
-              <w:t>Regression DLM</w:t>
+              <w:t>Dynamic regression model</w:t>
             </w:r>
           </w:p>
         </w:tc>
@@ -1973,7 +3109,7 @@
                 <w:color w:val="202124"/>
                 <w:sz w:val="17"/>
               </w:rPr>
-              <w:t>Links latent KPI dynamics to macro covariates.</w:t>
+              <w:t>Adds economic variables to a time-series model whose financial level changes over time.</w:t>
             </w:r>
           </w:p>
         </w:tc>
@@ -2000,7 +3136,7 @@
                 <w:color w:val="202124"/>
                 <w:sz w:val="17"/>
               </w:rPr>
-              <w:t>Tests whether rates and business-cycle conditions improve forecasts without assuming static relationships.</w:t>
+              <w:t>Tests whether rates and business-cycle conditions improve forecasts.</w:t>
             </w:r>
           </w:p>
         </w:tc>
@@ -2023,7 +3159,7 @@
           <w:color w:val="202124"/>
           <w:sz w:val="21"/>
         </w:rPr>
-        <w:t>Model selection emphasizes horizon-specific RMSE and interval coverage rather than in-sample fit. Prediction intervals are essential in financial analysis because a point forecast can imply false precision. Observed under-coverage for several four-quarter forecasts is retained as a limitation and argues for conformal or regime-adaptive intervals in Phase 2.</w:t>
+        <w:t>Forecast models are compared using root mean squared error (RMSE), which summarizes the typical size of forecast mistakes while giving larger errors more weight. The study also checks whether forecast ranges contain the eventual result as often as intended. These ranges matter because one point forecast can look more certain than it really is. Several four-quarter ranges were too narrow, so forecast uncertainty remains a limitation.</w:t>
       </w:r>
     </w:p>
     <w:p>
@@ -2039,7 +3175,7 @@
           <w:color w:val="17365D"/>
           <w:sz w:val="32"/>
         </w:rPr>
-        <w:t>5. Classification methodology and model governance</w:t>
+        <w:t>6. Classification methodology and model governance</w:t>
       </w:r>
     </w:p>
     <w:p>
@@ -2084,7 +3220,7 @@
           <w:color w:val="202124"/>
           <w:sz w:val="21"/>
         </w:rPr>
-        <w:t>Class imbalance makes accuracy unsuitable. PR-AUC evaluates ranking quality for the positive class, recall measures event capture, precision measures analyst workload quality, top-decile lift measures concentration in the highest-priority queue, Brier score evaluates probabilistic accuracy, and calibration error tests whether numerical risks correspond to observed frequencies. No single metric is sufficient for a surveillance product.</w:t>
+        <w:t>Only a minority of observations are deterioration events, so simple accuracy can be misleading. PR-AUC summarizes how well the model separates deterioration cases while focusing on the less common event class. Recall is the percentage of actual events detected. Precision is the percentage of alerts that became events. Top-decile lift compares the event rate among the highest-risk 10% with the overall event rate. Brier score measures the average squared error of the probabilities, and calibration checks whether a stated risk such as 30% occurs about 30% of the time. No single measure answers every business question.</w:t>
       </w:r>
     </w:p>
     <w:p>
@@ -2100,7 +3236,7 @@
           <w:color w:val="17365D"/>
           <w:sz w:val="32"/>
         </w:rPr>
-        <w:t>6. Temporal validation, leakage prevention, and champion selection</w:t>
+        <w:t>7. Temporal validation, leakage prevention, and champion selection</w:t>
       </w:r>
     </w:p>
     <w:p>
@@ -2115,7 +3251,7 @@
           <w:color w:val="202124"/>
           <w:sz w:val="21"/>
         </w:rPr>
-        <w:t>Three expanding-window folds simulate repeated deployment through time. Preprocessing, calibration, model fitting, and forecast generation are performed inside each fold. Label-availability embargoes exclude outcomes that would not yet be observable. Development probabilities shown in downstream products are out of fold; training-history rows with no defensible out-of-sample score remain explicitly unscored.</w:t>
+        <w:t>Three expanding training windows simulate how the model would have been rebuilt and tested as time moved forward. Data preparation, probability adjustment, model fitting, and forecasting are repeated separately inside each window. Outcomes that would not yet have been known are excluded. Out-of-fold means that every development prediction came from a model that was not trained on that observation. Historical rows without a defensible out-of-sample prediction remain unscored.</w:t>
       </w:r>
     </w:p>
     <w:p>
@@ -2130,7 +3266,7 @@
           <w:color w:val="202124"/>
           <w:sz w:val="21"/>
         </w:rPr>
-        <w:t>The champion was selected using development OOF PR-AUC first, then calibration, sector/time stability, interpretability, and simplicity. The final 2023+ holdout was evaluated exactly once after the champion record was frozen and hashed. The holdout alert-rate increase to 35.45% is treated as distribution shift, not an opportunity for retrospective threshold tuning.</w:t>
+        <w:t>The final model was chosen first by development PR-AUC, then by probability reliability, stability across sectors and time, interpretability, and simplicity. The 2023-and-later holdout was kept untouched until the model choice was recorded. Its higher 35.45% alert rate is treated as evidence that the later period differed from development, not as permission to adjust the threshold after seeing the answer.</w:t>
       </w:r>
     </w:p>
     <w:p>
@@ -2142,7 +3278,7 @@
         <w:drawing>
           <wp:inline xmlns:a="http://schemas.openxmlformats.org/drawingml/2006/main" xmlns:pic="http://schemas.openxmlformats.org/drawingml/2006/picture">
             <wp:extent cx="5760720" cy="2810108"/>
-            <wp:docPr id="3" name="Picture 3"/>
+            <wp:docPr id="5" name="Picture 5"/>
             <wp:cNvGraphicFramePr>
               <a:graphicFrameLocks noChangeAspect="1"/>
             </wp:cNvGraphicFramePr>
@@ -2154,7 +3290,7 @@
                     <pic:cNvPicPr/>
                   </pic:nvPicPr>
                   <pic:blipFill>
-                    <a:blip r:embed="rId13"/>
+                    <a:blip r:embed="rId15"/>
                     <a:stretch>
                       <a:fillRect/>
                     </a:stretch>
@@ -2186,7 +3322,7 @@
           <w:color w:val="667085"/>
           <w:sz w:val="17"/>
         </w:rPr>
-        <w:t>Figure 3. Temporal OOF results expose regime sensitivity that a random split would conceal.</w:t>
+        <w:t>Figure 5. Temporal OOF results expose regime sensitivity that a random split would conceal.</w:t>
       </w:r>
     </w:p>
     <w:p>
@@ -2202,7 +3338,7 @@
           <w:color w:val="17365D"/>
           <w:sz w:val="32"/>
         </w:rPr>
-        <w:t>7. Empirical results</w:t>
+        <w:t>8. Empirical results</w:t>
       </w:r>
     </w:p>
     <w:tbl>
@@ -3027,7 +4163,7 @@
           <w:color w:val="202124"/>
           <w:sz w:val="21"/>
         </w:rPr>
-        <w:t>The Utilities gap is material: PR-AUC and precision are lower even though Brier score is slightly better, demonstrating why discrimination and calibration must be evaluated separately. A model can produce numerically conservative probabilities while ranking positive cases imperfectly. Sector-specific recalibration, richer utility drivers, and broader samples are therefore Phase 2 priorities.</w:t>
+        <w:t>The Utilities gap is important: PR-AUC and precision are lower even though the Brier score is slightly better. This shows why ranking quality and probability accuracy must be reviewed separately. A model can produce fairly conservative probabilities yet still rank the actual deterioration cases imperfectly. The weaker Utilities result limits how confidently the model should be applied to that sector.</w:t>
       </w:r>
     </w:p>
     <w:p>
@@ -3039,7 +4175,7 @@
         <w:drawing>
           <wp:inline xmlns:a="http://schemas.openxmlformats.org/drawingml/2006/main" xmlns:pic="http://schemas.openxmlformats.org/drawingml/2006/picture">
             <wp:extent cx="5760720" cy="2950613"/>
-            <wp:docPr id="4" name="Picture 4"/>
+            <wp:docPr id="6" name="Picture 6"/>
             <wp:cNvGraphicFramePr>
               <a:graphicFrameLocks noChangeAspect="1"/>
             </wp:cNvGraphicFramePr>
@@ -3051,7 +4187,7 @@
                     <pic:cNvPicPr/>
                   </pic:nvPicPr>
                   <pic:blipFill>
-                    <a:blip r:embed="rId14"/>
+                    <a:blip r:embed="rId16"/>
                     <a:stretch>
                       <a:fillRect/>
                     </a:stretch>
@@ -3083,7 +4219,408 @@
           <w:color w:val="667085"/>
           <w:sz w:val="17"/>
         </w:rPr>
-        <w:t>Figure 4. Locked-holdout sector results. Higher PR-AUC, recall, and precision are better.</w:t>
+        <w:t>Figure 6. Locked-holdout sector results. Higher PR-AUC, recall, and precision are better.</w:t>
+      </w:r>
+    </w:p>
+    <w:p>
+      <w:pPr>
+        <w:pStyle w:val="Heading2"/>
+        <w:keepNext/>
+      </w:pPr>
+      <w:r>
+        <w:rPr>
+          <w:rFonts w:ascii="Calibri" w:hAnsi="Calibri"/>
+          <w:b/>
+          <w:i w:val="0"/>
+          <w:color w:val="17365D"/>
+          <w:sz w:val="26"/>
+        </w:rPr>
+        <w:t>8.1 Hypothesis findings</w:t>
+      </w:r>
+    </w:p>
+    <w:p>
+      <w:pPr>
+        <w:spacing w:after="120" w:line="264" w:lineRule="auto"/>
+      </w:pPr>
+      <w:r>
+        <w:rPr>
+          <w:rFonts w:ascii="Calibri" w:hAnsi="Calibri"/>
+          <w:b w:val="0"/>
+          <w:i w:val="0"/>
+          <w:color w:val="202124"/>
+          <w:sz w:val="21"/>
+        </w:rPr>
+        <w:t>The three hypotheses introduced at the beginning of the study were evaluated using the time-ordered development tests and the untouched final holdout. The conclusions below distinguish strong evidence from mixed evidence.</w:t>
+      </w:r>
+    </w:p>
+    <w:tbl>
+      <w:tblPr>
+        <w:tblStyle w:val="TableGrid"/>
+        <w:tblW w:type="dxa" w:w="9360"/>
+        <w:jc w:val="left"/>
+        <w:tblLayout w:type="fixed"/>
+        <w:tblLook w:firstColumn="1" w:firstRow="1" w:lastColumn="0" w:lastRow="0" w:noHBand="0" w:noVBand="1" w:val="04A0"/>
+        <w:tblInd w:w="120" w:type="dxa"/>
+      </w:tblPr>
+      <w:tblGrid>
+        <w:gridCol w:w="2300"/>
+        <w:gridCol w:w="1500"/>
+        <w:gridCol w:w="5560"/>
+      </w:tblGrid>
+      <w:tr>
+        <w:tc>
+          <w:tcPr>
+            <w:tcW w:type="dxa" w:w="2300"/>
+            <w:shd w:fill="EAF1F8"/>
+            <w:vAlign w:val="center"/>
+            <w:tcMar>
+              <w:top w:w="80" w:type="dxa"/>
+              <w:bottom w:w="80" w:type="dxa"/>
+              <w:start w:w="120" w:type="dxa"/>
+              <w:end w:w="120" w:type="dxa"/>
+            </w:tcMar>
+          </w:tcPr>
+          <w:p>
+            <w:pPr>
+              <w:spacing w:after="0"/>
+            </w:pPr>
+            <w:r>
+              <w:rPr>
+                <w:rFonts w:ascii="Calibri" w:hAnsi="Calibri"/>
+                <w:b/>
+                <w:i w:val="0"/>
+                <w:color w:val="17365D"/>
+                <w:sz w:val="18"/>
+              </w:rPr>
+              <w:t>Hypothesis</w:t>
+            </w:r>
+          </w:p>
+        </w:tc>
+        <w:tc>
+          <w:tcPr>
+            <w:tcW w:type="dxa" w:w="1500"/>
+            <w:shd w:fill="EAF1F8"/>
+            <w:vAlign w:val="center"/>
+            <w:tcMar>
+              <w:top w:w="80" w:type="dxa"/>
+              <w:bottom w:w="80" w:type="dxa"/>
+              <w:start w:w="120" w:type="dxa"/>
+              <w:end w:w="120" w:type="dxa"/>
+            </w:tcMar>
+          </w:tcPr>
+          <w:p>
+            <w:pPr>
+              <w:spacing w:after="0"/>
+            </w:pPr>
+            <w:r>
+              <w:rPr>
+                <w:rFonts w:ascii="Calibri" w:hAnsi="Calibri"/>
+                <w:b/>
+                <w:i w:val="0"/>
+                <w:color w:val="17365D"/>
+                <w:sz w:val="18"/>
+              </w:rPr>
+              <w:t>Conclusion</w:t>
+            </w:r>
+          </w:p>
+        </w:tc>
+        <w:tc>
+          <w:tcPr>
+            <w:tcW w:type="dxa" w:w="5560"/>
+            <w:shd w:fill="EAF1F8"/>
+            <w:vAlign w:val="center"/>
+            <w:tcMar>
+              <w:top w:w="80" w:type="dxa"/>
+              <w:bottom w:w="80" w:type="dxa"/>
+              <w:start w:w="120" w:type="dxa"/>
+              <w:end w:w="120" w:type="dxa"/>
+            </w:tcMar>
+          </w:tcPr>
+          <w:p>
+            <w:pPr>
+              <w:spacing w:after="0"/>
+            </w:pPr>
+            <w:r>
+              <w:rPr>
+                <w:rFonts w:ascii="Calibri" w:hAnsi="Calibri"/>
+                <w:b/>
+                <w:i w:val="0"/>
+                <w:color w:val="17365D"/>
+                <w:sz w:val="18"/>
+              </w:rPr>
+              <w:t>Evidence and interpretation</w:t>
+            </w:r>
+          </w:p>
+        </w:tc>
+      </w:tr>
+      <w:tr>
+        <w:tc>
+          <w:tcPr>
+            <w:tcW w:type="dxa" w:w="2300"/>
+            <w:vAlign w:val="center"/>
+            <w:tcMar>
+              <w:top w:w="80" w:type="dxa"/>
+              <w:bottom w:w="80" w:type="dxa"/>
+              <w:start w:w="120" w:type="dxa"/>
+              <w:end w:w="120" w:type="dxa"/>
+            </w:tcMar>
+          </w:tcPr>
+          <w:p>
+            <w:pPr>
+              <w:spacing w:after="0"/>
+            </w:pPr>
+            <w:r>
+              <w:rPr>
+                <w:rFonts w:ascii="Calibri" w:hAnsi="Calibri"/>
+                <w:b w:val="0"/>
+                <w:i w:val="0"/>
+                <w:color w:val="202124"/>
+                <w:sz w:val="17"/>
+              </w:rPr>
+              <w:t>H1: Combining signals improves ranking</w:t>
+            </w:r>
+          </w:p>
+        </w:tc>
+        <w:tc>
+          <w:tcPr>
+            <w:tcW w:type="dxa" w:w="1500"/>
+            <w:vAlign w:val="center"/>
+            <w:tcMar>
+              <w:top w:w="80" w:type="dxa"/>
+              <w:bottom w:w="80" w:type="dxa"/>
+              <w:start w:w="120" w:type="dxa"/>
+              <w:end w:w="120" w:type="dxa"/>
+            </w:tcMar>
+          </w:tcPr>
+          <w:p>
+            <w:pPr>
+              <w:spacing w:after="0"/>
+            </w:pPr>
+            <w:r>
+              <w:rPr>
+                <w:rFonts w:ascii="Calibri" w:hAnsi="Calibri"/>
+                <w:b w:val="0"/>
+                <w:i w:val="0"/>
+                <w:color w:val="202124"/>
+                <w:sz w:val="17"/>
+              </w:rPr>
+              <w:t>Supported</w:t>
+            </w:r>
+          </w:p>
+        </w:tc>
+        <w:tc>
+          <w:tcPr>
+            <w:tcW w:type="dxa" w:w="5560"/>
+            <w:vAlign w:val="center"/>
+            <w:tcMar>
+              <w:top w:w="80" w:type="dxa"/>
+              <w:bottom w:w="80" w:type="dxa"/>
+              <w:start w:w="120" w:type="dxa"/>
+              <w:end w:w="120" w:type="dxa"/>
+            </w:tcMar>
+          </w:tcPr>
+          <w:p>
+            <w:pPr>
+              <w:spacing w:after="0"/>
+            </w:pPr>
+            <w:r>
+              <w:rPr>
+                <w:rFonts w:ascii="Calibri" w:hAnsi="Calibri"/>
+                <w:b w:val="0"/>
+                <w:i w:val="0"/>
+                <w:color w:val="202124"/>
+                <w:sz w:val="17"/>
+              </w:rPr>
+              <w:t>For gradient-boosted trees, average development PR-AUC increased from 0.332 with current fundamentals alone to 0.416 with macroeconomic variables and limited interactions. The broader feature set exceeded the current-only model in every reported time-period and sector slice. This supports combining company, peer, and economic information for risk ranking.</w:t>
+            </w:r>
+          </w:p>
+        </w:tc>
+      </w:tr>
+      <w:tr>
+        <w:tc>
+          <w:tcPr>
+            <w:tcW w:type="dxa" w:w="2300"/>
+            <w:vAlign w:val="center"/>
+            <w:tcMar>
+              <w:top w:w="80" w:type="dxa"/>
+              <w:bottom w:w="80" w:type="dxa"/>
+              <w:start w:w="120" w:type="dxa"/>
+              <w:end w:w="120" w:type="dxa"/>
+            </w:tcMar>
+          </w:tcPr>
+          <w:p>
+            <w:pPr>
+              <w:spacing w:after="0"/>
+            </w:pPr>
+            <w:r>
+              <w:rPr>
+                <w:rFonts w:ascii="Calibri" w:hAnsi="Calibri"/>
+                <w:b w:val="0"/>
+                <w:i w:val="0"/>
+                <w:color w:val="202124"/>
+                <w:sz w:val="17"/>
+              </w:rPr>
+              <w:t>H2: Forecasts add forward-looking information</w:t>
+            </w:r>
+          </w:p>
+        </w:tc>
+        <w:tc>
+          <w:tcPr>
+            <w:tcW w:type="dxa" w:w="1500"/>
+            <w:vAlign w:val="center"/>
+            <w:tcMar>
+              <w:top w:w="80" w:type="dxa"/>
+              <w:bottom w:w="80" w:type="dxa"/>
+              <w:start w:w="120" w:type="dxa"/>
+              <w:end w:w="120" w:type="dxa"/>
+            </w:tcMar>
+          </w:tcPr>
+          <w:p>
+            <w:pPr>
+              <w:spacing w:after="0"/>
+            </w:pPr>
+            <w:r>
+              <w:rPr>
+                <w:rFonts w:ascii="Calibri" w:hAnsi="Calibri"/>
+                <w:b w:val="0"/>
+                <w:i w:val="0"/>
+                <w:color w:val="202124"/>
+                <w:sz w:val="17"/>
+              </w:rPr>
+              <w:t>Partially supported</w:t>
+            </w:r>
+          </w:p>
+        </w:tc>
+        <w:tc>
+          <w:tcPr>
+            <w:tcW w:type="dxa" w:w="5560"/>
+            <w:vAlign w:val="center"/>
+            <w:tcMar>
+              <w:top w:w="80" w:type="dxa"/>
+              <w:bottom w:w="80" w:type="dxa"/>
+              <w:start w:w="120" w:type="dxa"/>
+              <w:end w:w="120" w:type="dxa"/>
+            </w:tcMar>
+          </w:tcPr>
+          <w:p>
+            <w:pPr>
+              <w:spacing w:after="0"/>
+            </w:pPr>
+            <w:r>
+              <w:rPr>
+                <w:rFonts w:ascii="Calibri" w:hAnsi="Calibri"/>
+                <w:b w:val="0"/>
+                <w:i w:val="0"/>
+                <w:color w:val="202124"/>
+                <w:sz w:val="17"/>
+              </w:rPr>
+              <w:t>For gradient-boosted trees, adding all KPI forecasts increased average development PR-AUC from 0.389 for historical-and-peer information to 0.417. However, the improvement did not appear in every time period, and forecast additions did not improve logistic regression. Forecasts contributed useful information in some settings, but the evidence is not strong enough to claim that they always improve the model.</w:t>
+            </w:r>
+          </w:p>
+        </w:tc>
+      </w:tr>
+      <w:tr>
+        <w:tc>
+          <w:tcPr>
+            <w:tcW w:type="dxa" w:w="2300"/>
+            <w:vAlign w:val="center"/>
+            <w:tcMar>
+              <w:top w:w="80" w:type="dxa"/>
+              <w:bottom w:w="80" w:type="dxa"/>
+              <w:start w:w="120" w:type="dxa"/>
+              <w:end w:w="120" w:type="dxa"/>
+            </w:tcMar>
+          </w:tcPr>
+          <w:p>
+            <w:pPr>
+              <w:spacing w:after="0"/>
+            </w:pPr>
+            <w:r>
+              <w:rPr>
+                <w:rFonts w:ascii="Calibri" w:hAnsi="Calibri"/>
+                <w:b w:val="0"/>
+                <w:i w:val="0"/>
+                <w:color w:val="202124"/>
+                <w:sz w:val="17"/>
+              </w:rPr>
+              <w:t>H3: Performance changes by sector and time period</w:t>
+            </w:r>
+          </w:p>
+        </w:tc>
+        <w:tc>
+          <w:tcPr>
+            <w:tcW w:type="dxa" w:w="1500"/>
+            <w:vAlign w:val="center"/>
+            <w:tcMar>
+              <w:top w:w="80" w:type="dxa"/>
+              <w:bottom w:w="80" w:type="dxa"/>
+              <w:start w:w="120" w:type="dxa"/>
+              <w:end w:w="120" w:type="dxa"/>
+            </w:tcMar>
+          </w:tcPr>
+          <w:p>
+            <w:pPr>
+              <w:spacing w:after="0"/>
+            </w:pPr>
+            <w:r>
+              <w:rPr>
+                <w:rFonts w:ascii="Calibri" w:hAnsi="Calibri"/>
+                <w:b w:val="0"/>
+                <w:i w:val="0"/>
+                <w:color w:val="202124"/>
+                <w:sz w:val="17"/>
+              </w:rPr>
+              <w:t>Supported</w:t>
+            </w:r>
+          </w:p>
+        </w:tc>
+        <w:tc>
+          <w:tcPr>
+            <w:tcW w:type="dxa" w:w="5560"/>
+            <w:vAlign w:val="center"/>
+            <w:tcMar>
+              <w:top w:w="80" w:type="dxa"/>
+              <w:bottom w:w="80" w:type="dxa"/>
+              <w:start w:w="120" w:type="dxa"/>
+              <w:end w:w="120" w:type="dxa"/>
+            </w:tcMar>
+          </w:tcPr>
+          <w:p>
+            <w:pPr>
+              <w:spacing w:after="0"/>
+            </w:pPr>
+            <w:r>
+              <w:rPr>
+                <w:rFonts w:ascii="Calibri" w:hAnsi="Calibri"/>
+                <w:b w:val="0"/>
+                <w:i w:val="0"/>
+                <w:color w:val="202124"/>
+                <w:sz w:val="17"/>
+              </w:rPr>
+              <w:t>Results varied across the three development windows and between sectors. On the final holdout, Consumer Discretionary PR-AUC was 0.468 with 0.439 precision, while Utilities PR-AUC was 0.332 with 0.225 precision. These differences support separate sector and time-period reporting rather than relying only on one overall score.</w:t>
+            </w:r>
+          </w:p>
+        </w:tc>
+      </w:tr>
+    </w:tbl>
+    <w:p>
+      <w:pPr>
+        <w:spacing w:after="0"/>
+      </w:pPr>
+    </w:p>
+    <w:p>
+      <w:pPr>
+        <w:spacing w:after="120" w:line="264" w:lineRule="auto"/>
+      </w:pPr>
+      <w:r>
+        <w:rPr>
+          <w:rFonts w:ascii="Calibri" w:hAnsi="Calibri"/>
+          <w:b w:val="0"/>
+          <w:i w:val="0"/>
+          <w:color w:val="202124"/>
+          <w:sz w:val="21"/>
+        </w:rPr>
+        <w:t>Overall, the study supports the value of combining several types of information and confirms that model performance depends on sector and time period. Forecast features appear promising but require further testing before they should be treated as a consistently reliable improvement.</w:t>
       </w:r>
     </w:p>
     <w:p>
@@ -3099,7 +4636,7 @@
           <w:color w:val="17365D"/>
           <w:sz w:val="32"/>
         </w:rPr>
-        <w:t>8. Latest portfolio surveillance results</w:t>
+        <w:t>9. Latest portfolio surveillance results</w:t>
       </w:r>
     </w:p>
     <w:p>
@@ -3126,7 +4663,7 @@
         <w:drawing>
           <wp:inline xmlns:a="http://schemas.openxmlformats.org/drawingml/2006/main" xmlns:pic="http://schemas.openxmlformats.org/drawingml/2006/picture">
             <wp:extent cx="5760720" cy="3231624"/>
-            <wp:docPr id="5" name="Picture 5"/>
+            <wp:docPr id="7" name="Picture 7"/>
             <wp:cNvGraphicFramePr>
               <a:graphicFrameLocks noChangeAspect="1"/>
             </wp:cNvGraphicFramePr>
@@ -3138,7 +4675,7 @@
                     <pic:cNvPicPr/>
                   </pic:nvPicPr>
                   <pic:blipFill>
-                    <a:blip r:embed="rId15"/>
+                    <a:blip r:embed="rId17"/>
                     <a:stretch>
                       <a:fillRect/>
                     </a:stretch>
@@ -3170,7 +4707,7 @@
           <w:color w:val="667085"/>
           <w:sz w:val="17"/>
         </w:rPr>
-        <w:t>Figure 5. Highest latest risk estimates; company rankings are analytical screening outputs, not investment recommendations.</w:t>
+        <w:t>Figure 7. Highest latest risk estimates; company rankings are analytical screening outputs, not investment recommendations.</w:t>
       </w:r>
     </w:p>
     <w:p>
@@ -3186,67 +4723,6 @@
           <w:sz w:val="21"/>
         </w:rPr>
         <w:t>The highest risk names should be investigated through an analyst workflow: review filing recency, reconcile the source facts, inspect KPI and forecast paths, assess one-off accounting items, compare peers, and document whether the signal reflects operating deterioration, financing structure, capital expenditure, or model uncertainty. The risk reason is a diagnostic prompt rather than a causal explanation.</w:t>
-      </w:r>
-    </w:p>
-    <w:p>
-      <w:pPr>
-        <w:pStyle w:val="Heading1"/>
-        <w:keepNext/>
-      </w:pPr>
-      <w:r>
-        <w:rPr>
-          <w:rFonts w:ascii="Calibri" w:hAnsi="Calibri"/>
-          <w:b/>
-          <w:i w:val="0"/>
-          <w:color w:val="17365D"/>
-          <w:sz w:val="32"/>
-        </w:rPr>
-        <w:t>9. Power BI analytical product and Stage 17 delivery</w:t>
-      </w:r>
-    </w:p>
-    <w:p>
-      <w:pPr>
-        <w:spacing w:after="120" w:line="264" w:lineRule="auto"/>
-      </w:pPr>
-      <w:r>
-        <w:rPr>
-          <w:rFonts w:ascii="Calibri" w:hAnsi="Calibri"/>
-          <w:b w:val="0"/>
-          <w:i w:val="0"/>
-          <w:color w:val="202124"/>
-          <w:sz w:val="21"/>
-        </w:rPr>
-        <w:t>The Power BI package embeds four certified tables at distinct grains: a two-row sector portfolio table, a 60-row latest-company watchlist, 3,150 company-quarter history rows, and 93 model/fold/sector performance rows. The semantic model uses one-to-many sector and company relationships while leaving performance disconnected to avoid ambiguous cross-grain filtering.</w:t>
-      </w:r>
-    </w:p>
-    <w:p>
-      <w:pPr>
-        <w:spacing w:after="120" w:line="264" w:lineRule="auto"/>
-      </w:pPr>
-      <w:r>
-        <w:rPr>
-          <w:rFonts w:ascii="Calibri" w:hAnsi="Calibri"/>
-          <w:b w:val="0"/>
-          <w:i w:val="0"/>
-          <w:color w:val="202124"/>
-          <w:sz w:val="21"/>
-        </w:rPr>
-        <w:t>The four-page architecture separates decision layers: Portfolio Overview for risk concentration, Analyst Watchlist for triage, Company Detail for temporal diagnostics, and Model Performance for governance. Percentages, ratios, and coverage multiples are intentionally separated; interest coverage and debt-to-assets are not placed on a shared raw axis. A visible disclaimer is required wherever risk estimates are summarized.</w:t>
-      </w:r>
-    </w:p>
-    <w:p>
-      <w:pPr>
-        <w:spacing w:after="120" w:line="264" w:lineRule="auto"/>
-      </w:pPr>
-      <w:r>
-        <w:rPr>
-          <w:rFonts w:ascii="Calibri" w:hAnsi="Calibri"/>
-          <w:b w:val="0"/>
-          <w:i w:val="0"/>
-          <w:color w:val="202124"/>
-          <w:sz w:val="21"/>
-        </w:rPr>
-        <w:t>Artifact audit note. The PBIX opens as a valid package and contains the four named pages and embedded data model. The supplied authoring-canvas screenshots reconcile the headline KPIs, but they also show several unbound placeholder visuals. Those visual bindings require a future Power BI Desktop editing pass before the dashboard should be described as presentation-ready; the repository records this limitation explicitly.</w:t>
       </w:r>
     </w:p>
     <w:p>
@@ -3420,23 +4896,6 @@
     </w:p>
     <w:p>
       <w:pPr>
-        <w:pStyle w:val="ListBullet"/>
-        <w:spacing w:after="100" w:line="280" w:lineRule="auto"/>
-        <w:ind w:left="720" w:hanging="360"/>
-      </w:pPr>
-      <w:r>
-        <w:rPr>
-          <w:rFonts w:ascii="Calibri" w:hAnsi="Calibri"/>
-          <w:b w:val="0"/>
-          <w:i w:val="0"/>
-          <w:color w:val="202124"/>
-          <w:sz w:val="20"/>
-        </w:rPr>
-        <w:t>Dashboard readiness: several supplied Power BI visuals remain unbound placeholders even though the package, model, pages, and headline reconciliation are valid.</w:t>
-      </w:r>
-    </w:p>
-    <w:p>
-      <w:pPr>
         <w:pStyle w:val="Heading1"/>
         <w:keepNext/>
       </w:pPr>
@@ -3479,1052 +4938,6 @@
           <w:sz w:val="21"/>
         </w:rPr>
         <w:t>The model shows meaningful ranking value and economically interpretable portfolio signals, especially in Consumer Discretionary. At the same time, moderate precision, sector heterogeneity, forecast-interval under-coverage, and survivorship bias constrain deployment. The appropriate conclusion is controlled analyst augmentation: prioritize review, surface evidence, measure uncertainty, and preserve human judgment.</w:t>
-      </w:r>
-    </w:p>
-    <w:p>
-      <w:pPr>
-        <w:pStyle w:val="Heading1"/>
-        <w:keepNext/>
-      </w:pPr>
-      <w:r>
-        <w:rPr>
-          <w:rFonts w:ascii="Calibri" w:hAnsi="Calibri"/>
-          <w:b/>
-          <w:i w:val="0"/>
-          <w:color w:val="17365D"/>
-          <w:sz w:val="32"/>
-        </w:rPr>
-        <w:t>12. Phase 2 research and product roadmap</w:t>
-      </w:r>
-    </w:p>
-    <w:tbl>
-      <w:tblPr>
-        <w:tblStyle w:val="TableGrid"/>
-        <w:tblW w:type="dxa" w:w="9360"/>
-        <w:jc w:val="left"/>
-        <w:tblLayout w:type="fixed"/>
-        <w:tblLook w:firstColumn="1" w:firstRow="1" w:lastColumn="0" w:lastRow="0" w:noHBand="0" w:noVBand="1" w:val="04A0"/>
-        <w:tblInd w:w="120" w:type="dxa"/>
-      </w:tblPr>
-      <w:tblGrid>
-        <w:gridCol w:w="700"/>
-        <w:gridCol w:w="2850"/>
-        <w:gridCol w:w="2980"/>
-        <w:gridCol w:w="2830"/>
-      </w:tblGrid>
-      <w:tr>
-        <w:tc>
-          <w:tcPr>
-            <w:tcW w:type="dxa" w:w="700"/>
-            <w:shd w:fill="EAF1F8"/>
-            <w:vAlign w:val="center"/>
-            <w:tcMar>
-              <w:top w:w="80" w:type="dxa"/>
-              <w:bottom w:w="80" w:type="dxa"/>
-              <w:start w:w="120" w:type="dxa"/>
-              <w:end w:w="120" w:type="dxa"/>
-            </w:tcMar>
-          </w:tcPr>
-          <w:p>
-            <w:pPr>
-              <w:spacing w:after="0"/>
-            </w:pPr>
-            <w:r>
-              <w:rPr>
-                <w:rFonts w:ascii="Calibri" w:hAnsi="Calibri"/>
-                <w:b/>
-                <w:i w:val="0"/>
-                <w:color w:val="17365D"/>
-                <w:sz w:val="18"/>
-              </w:rPr>
-              <w:t>Priority</w:t>
-            </w:r>
-          </w:p>
-        </w:tc>
-        <w:tc>
-          <w:tcPr>
-            <w:tcW w:type="dxa" w:w="2850"/>
-            <w:shd w:fill="EAF1F8"/>
-            <w:vAlign w:val="center"/>
-            <w:tcMar>
-              <w:top w:w="80" w:type="dxa"/>
-              <w:bottom w:w="80" w:type="dxa"/>
-              <w:start w:w="120" w:type="dxa"/>
-              <w:end w:w="120" w:type="dxa"/>
-            </w:tcMar>
-          </w:tcPr>
-          <w:p>
-            <w:pPr>
-              <w:spacing w:after="0"/>
-            </w:pPr>
-            <w:r>
-              <w:rPr>
-                <w:rFonts w:ascii="Calibri" w:hAnsi="Calibri"/>
-                <w:b/>
-                <w:i w:val="0"/>
-                <w:color w:val="17365D"/>
-                <w:sz w:val="18"/>
-              </w:rPr>
-              <w:t>Phase 2 goal</w:t>
-            </w:r>
-          </w:p>
-        </w:tc>
-        <w:tc>
-          <w:tcPr>
-            <w:tcW w:type="dxa" w:w="2980"/>
-            <w:shd w:fill="EAF1F8"/>
-            <w:vAlign w:val="center"/>
-            <w:tcMar>
-              <w:top w:w="80" w:type="dxa"/>
-              <w:bottom w:w="80" w:type="dxa"/>
-              <w:start w:w="120" w:type="dxa"/>
-              <w:end w:w="120" w:type="dxa"/>
-            </w:tcMar>
-          </w:tcPr>
-          <w:p>
-            <w:pPr>
-              <w:spacing w:after="0"/>
-            </w:pPr>
-            <w:r>
-              <w:rPr>
-                <w:rFonts w:ascii="Calibri" w:hAnsi="Calibri"/>
-                <w:b/>
-                <w:i w:val="0"/>
-                <w:color w:val="17365D"/>
-                <w:sz w:val="18"/>
-              </w:rPr>
-              <w:t>Why it matters</w:t>
-            </w:r>
-          </w:p>
-        </w:tc>
-        <w:tc>
-          <w:tcPr>
-            <w:tcW w:type="dxa" w:w="2830"/>
-            <w:shd w:fill="EAF1F8"/>
-            <w:vAlign w:val="center"/>
-            <w:tcMar>
-              <w:top w:w="80" w:type="dxa"/>
-              <w:bottom w:w="80" w:type="dxa"/>
-              <w:start w:w="120" w:type="dxa"/>
-              <w:end w:w="120" w:type="dxa"/>
-            </w:tcMar>
-          </w:tcPr>
-          <w:p>
-            <w:pPr>
-              <w:spacing w:after="0"/>
-            </w:pPr>
-            <w:r>
-              <w:rPr>
-                <w:rFonts w:ascii="Calibri" w:hAnsi="Calibri"/>
-                <w:b/>
-                <w:i w:val="0"/>
-                <w:color w:val="17365D"/>
-                <w:sz w:val="18"/>
-              </w:rPr>
-              <w:t>Acceptance evidence</w:t>
-            </w:r>
-          </w:p>
-        </w:tc>
-      </w:tr>
-      <w:tr>
-        <w:tc>
-          <w:tcPr>
-            <w:tcW w:type="dxa" w:w="700"/>
-            <w:vAlign w:val="center"/>
-            <w:tcMar>
-              <w:top w:w="80" w:type="dxa"/>
-              <w:bottom w:w="80" w:type="dxa"/>
-              <w:start w:w="120" w:type="dxa"/>
-              <w:end w:w="120" w:type="dxa"/>
-            </w:tcMar>
-          </w:tcPr>
-          <w:p>
-            <w:pPr>
-              <w:spacing w:after="0"/>
-            </w:pPr>
-            <w:r>
-              <w:rPr>
-                <w:rFonts w:ascii="Calibri" w:hAnsi="Calibri"/>
-                <w:b w:val="0"/>
-                <w:i w:val="0"/>
-                <w:color w:val="202124"/>
-                <w:sz w:val="17"/>
-              </w:rPr>
-              <w:t>1</w:t>
-            </w:r>
-          </w:p>
-        </w:tc>
-        <w:tc>
-          <w:tcPr>
-            <w:tcW w:type="dxa" w:w="2850"/>
-            <w:vAlign w:val="center"/>
-            <w:tcMar>
-              <w:top w:w="80" w:type="dxa"/>
-              <w:bottom w:w="80" w:type="dxa"/>
-              <w:start w:w="120" w:type="dxa"/>
-              <w:end w:w="120" w:type="dxa"/>
-            </w:tcMar>
-          </w:tcPr>
-          <w:p>
-            <w:pPr>
-              <w:spacing w:after="0"/>
-            </w:pPr>
-            <w:r>
-              <w:rPr>
-                <w:rFonts w:ascii="Calibri" w:hAnsi="Calibri"/>
-                <w:b w:val="0"/>
-                <w:i w:val="0"/>
-                <w:color w:val="202124"/>
-                <w:sz w:val="17"/>
-              </w:rPr>
-              <w:t>Expand to point-in-time listed and delisted histories across additional sectors</w:t>
-            </w:r>
-          </w:p>
-        </w:tc>
-        <w:tc>
-          <w:tcPr>
-            <w:tcW w:type="dxa" w:w="2980"/>
-            <w:vAlign w:val="center"/>
-            <w:tcMar>
-              <w:top w:w="80" w:type="dxa"/>
-              <w:bottom w:w="80" w:type="dxa"/>
-              <w:start w:w="120" w:type="dxa"/>
-              <w:end w:w="120" w:type="dxa"/>
-            </w:tcMar>
-          </w:tcPr>
-          <w:p>
-            <w:pPr>
-              <w:spacing w:after="0"/>
-            </w:pPr>
-            <w:r>
-              <w:rPr>
-                <w:rFonts w:ascii="Calibri" w:hAnsi="Calibri"/>
-                <w:b w:val="0"/>
-                <w:i w:val="0"/>
-                <w:color w:val="202124"/>
-                <w:sz w:val="17"/>
-              </w:rPr>
-              <w:t>Reduces survivorship bias and tests cross-sector transportability</w:t>
-            </w:r>
-          </w:p>
-        </w:tc>
-        <w:tc>
-          <w:tcPr>
-            <w:tcW w:type="dxa" w:w="2830"/>
-            <w:vAlign w:val="center"/>
-            <w:tcMar>
-              <w:top w:w="80" w:type="dxa"/>
-              <w:bottom w:w="80" w:type="dxa"/>
-              <w:start w:w="120" w:type="dxa"/>
-              <w:end w:w="120" w:type="dxa"/>
-            </w:tcMar>
-          </w:tcPr>
-          <w:p>
-            <w:pPr>
-              <w:spacing w:after="0"/>
-            </w:pPr>
-            <w:r>
-              <w:rPr>
-                <w:rFonts w:ascii="Calibri" w:hAnsi="Calibri"/>
-                <w:b w:val="0"/>
-                <w:i w:val="0"/>
-                <w:color w:val="202124"/>
-                <w:sz w:val="17"/>
-              </w:rPr>
-              <w:t>Frozen broader universe; sector/time holdouts; coverage audit</w:t>
-            </w:r>
-          </w:p>
-        </w:tc>
-      </w:tr>
-      <w:tr>
-        <w:tc>
-          <w:tcPr>
-            <w:tcW w:type="dxa" w:w="700"/>
-            <w:vAlign w:val="center"/>
-            <w:tcMar>
-              <w:top w:w="80" w:type="dxa"/>
-              <w:bottom w:w="80" w:type="dxa"/>
-              <w:start w:w="120" w:type="dxa"/>
-              <w:end w:w="120" w:type="dxa"/>
-            </w:tcMar>
-          </w:tcPr>
-          <w:p>
-            <w:pPr>
-              <w:spacing w:after="0"/>
-            </w:pPr>
-            <w:r>
-              <w:rPr>
-                <w:rFonts w:ascii="Calibri" w:hAnsi="Calibri"/>
-                <w:b w:val="0"/>
-                <w:i w:val="0"/>
-                <w:color w:val="202124"/>
-                <w:sz w:val="17"/>
-              </w:rPr>
-              <w:t>2</w:t>
-            </w:r>
-          </w:p>
-        </w:tc>
-        <w:tc>
-          <w:tcPr>
-            <w:tcW w:type="dxa" w:w="2850"/>
-            <w:vAlign w:val="center"/>
-            <w:tcMar>
-              <w:top w:w="80" w:type="dxa"/>
-              <w:bottom w:w="80" w:type="dxa"/>
-              <w:start w:w="120" w:type="dxa"/>
-              <w:end w:w="120" w:type="dxa"/>
-            </w:tcMar>
-          </w:tcPr>
-          <w:p>
-            <w:pPr>
-              <w:spacing w:after="0"/>
-            </w:pPr>
-            <w:r>
-              <w:rPr>
-                <w:rFonts w:ascii="Calibri" w:hAnsi="Calibri"/>
-                <w:b w:val="0"/>
-                <w:i w:val="0"/>
-                <w:color w:val="202124"/>
-                <w:sz w:val="17"/>
-              </w:rPr>
-              <w:t>Prospective shadow scoring with drift monitoring</w:t>
-            </w:r>
-          </w:p>
-        </w:tc>
-        <w:tc>
-          <w:tcPr>
-            <w:tcW w:type="dxa" w:w="2980"/>
-            <w:vAlign w:val="center"/>
-            <w:tcMar>
-              <w:top w:w="80" w:type="dxa"/>
-              <w:bottom w:w="80" w:type="dxa"/>
-              <w:start w:w="120" w:type="dxa"/>
-              <w:end w:w="120" w:type="dxa"/>
-            </w:tcMar>
-          </w:tcPr>
-          <w:p>
-            <w:pPr>
-              <w:spacing w:after="0"/>
-            </w:pPr>
-            <w:r>
-              <w:rPr>
-                <w:rFonts w:ascii="Calibri" w:hAnsi="Calibri"/>
-                <w:b w:val="0"/>
-                <w:i w:val="0"/>
-                <w:color w:val="202124"/>
-                <w:sz w:val="17"/>
-              </w:rPr>
-              <w:t>Retrospective results do not prove live operational stability</w:t>
-            </w:r>
-          </w:p>
-        </w:tc>
-        <w:tc>
-          <w:tcPr>
-            <w:tcW w:type="dxa" w:w="2830"/>
-            <w:vAlign w:val="center"/>
-            <w:tcMar>
-              <w:top w:w="80" w:type="dxa"/>
-              <w:bottom w:w="80" w:type="dxa"/>
-              <w:start w:w="120" w:type="dxa"/>
-              <w:end w:w="120" w:type="dxa"/>
-            </w:tcMar>
-          </w:tcPr>
-          <w:p>
-            <w:pPr>
-              <w:spacing w:after="0"/>
-            </w:pPr>
-            <w:r>
-              <w:rPr>
-                <w:rFonts w:ascii="Calibri" w:hAnsi="Calibri"/>
-                <w:b w:val="0"/>
-                <w:i w:val="0"/>
-                <w:color w:val="202124"/>
-                <w:sz w:val="17"/>
-              </w:rPr>
-              <w:t>Scheduled scores; PSI/drift alerts; realized-outcome registry</w:t>
-            </w:r>
-          </w:p>
-        </w:tc>
-      </w:tr>
-      <w:tr>
-        <w:tc>
-          <w:tcPr>
-            <w:tcW w:type="dxa" w:w="700"/>
-            <w:vAlign w:val="center"/>
-            <w:tcMar>
-              <w:top w:w="80" w:type="dxa"/>
-              <w:bottom w:w="80" w:type="dxa"/>
-              <w:start w:w="120" w:type="dxa"/>
-              <w:end w:w="120" w:type="dxa"/>
-            </w:tcMar>
-          </w:tcPr>
-          <w:p>
-            <w:pPr>
-              <w:spacing w:after="0"/>
-            </w:pPr>
-            <w:r>
-              <w:rPr>
-                <w:rFonts w:ascii="Calibri" w:hAnsi="Calibri"/>
-                <w:b w:val="0"/>
-                <w:i w:val="0"/>
-                <w:color w:val="202124"/>
-                <w:sz w:val="17"/>
-              </w:rPr>
-              <w:t>3</w:t>
-            </w:r>
-          </w:p>
-        </w:tc>
-        <w:tc>
-          <w:tcPr>
-            <w:tcW w:type="dxa" w:w="2850"/>
-            <w:vAlign w:val="center"/>
-            <w:tcMar>
-              <w:top w:w="80" w:type="dxa"/>
-              <w:bottom w:w="80" w:type="dxa"/>
-              <w:start w:w="120" w:type="dxa"/>
-              <w:end w:w="120" w:type="dxa"/>
-            </w:tcMar>
-          </w:tcPr>
-          <w:p>
-            <w:pPr>
-              <w:spacing w:after="0"/>
-            </w:pPr>
-            <w:r>
-              <w:rPr>
-                <w:rFonts w:ascii="Calibri" w:hAnsi="Calibri"/>
-                <w:b w:val="0"/>
-                <w:i w:val="0"/>
-                <w:color w:val="202124"/>
-                <w:sz w:val="17"/>
-              </w:rPr>
-              <w:t>Sector-aware and regime-aware calibration</w:t>
-            </w:r>
-          </w:p>
-        </w:tc>
-        <w:tc>
-          <w:tcPr>
-            <w:tcW w:type="dxa" w:w="2980"/>
-            <w:vAlign w:val="center"/>
-            <w:tcMar>
-              <w:top w:w="80" w:type="dxa"/>
-              <w:bottom w:w="80" w:type="dxa"/>
-              <w:start w:w="120" w:type="dxa"/>
-              <w:end w:w="120" w:type="dxa"/>
-            </w:tcMar>
-          </w:tcPr>
-          <w:p>
-            <w:pPr>
-              <w:spacing w:after="0"/>
-            </w:pPr>
-            <w:r>
-              <w:rPr>
-                <w:rFonts w:ascii="Calibri" w:hAnsi="Calibri"/>
-                <w:b w:val="0"/>
-                <w:i w:val="0"/>
-                <w:color w:val="202124"/>
-                <w:sz w:val="17"/>
-              </w:rPr>
-              <w:t>Utilities show weaker ranking/precision and higher calibration error</w:t>
-            </w:r>
-          </w:p>
-        </w:tc>
-        <w:tc>
-          <w:tcPr>
-            <w:tcW w:type="dxa" w:w="2830"/>
-            <w:vAlign w:val="center"/>
-            <w:tcMar>
-              <w:top w:w="80" w:type="dxa"/>
-              <w:bottom w:w="80" w:type="dxa"/>
-              <w:start w:w="120" w:type="dxa"/>
-              <w:end w:w="120" w:type="dxa"/>
-            </w:tcMar>
-          </w:tcPr>
-          <w:p>
-            <w:pPr>
-              <w:spacing w:after="0"/>
-            </w:pPr>
-            <w:r>
-              <w:rPr>
-                <w:rFonts w:ascii="Calibri" w:hAnsi="Calibri"/>
-                <w:b w:val="0"/>
-                <w:i w:val="0"/>
-                <w:color w:val="202124"/>
-                <w:sz w:val="17"/>
-              </w:rPr>
-              <w:t>Predeclared recalibration study with untouched evaluation windows</w:t>
-            </w:r>
-          </w:p>
-        </w:tc>
-      </w:tr>
-      <w:tr>
-        <w:tc>
-          <w:tcPr>
-            <w:tcW w:type="dxa" w:w="700"/>
-            <w:vAlign w:val="center"/>
-            <w:tcMar>
-              <w:top w:w="80" w:type="dxa"/>
-              <w:bottom w:w="80" w:type="dxa"/>
-              <w:start w:w="120" w:type="dxa"/>
-              <w:end w:w="120" w:type="dxa"/>
-            </w:tcMar>
-          </w:tcPr>
-          <w:p>
-            <w:pPr>
-              <w:spacing w:after="0"/>
-            </w:pPr>
-            <w:r>
-              <w:rPr>
-                <w:rFonts w:ascii="Calibri" w:hAnsi="Calibri"/>
-                <w:b w:val="0"/>
-                <w:i w:val="0"/>
-                <w:color w:val="202124"/>
-                <w:sz w:val="17"/>
-              </w:rPr>
-              <w:t>4</w:t>
-            </w:r>
-          </w:p>
-        </w:tc>
-        <w:tc>
-          <w:tcPr>
-            <w:tcW w:type="dxa" w:w="2850"/>
-            <w:vAlign w:val="center"/>
-            <w:tcMar>
-              <w:top w:w="80" w:type="dxa"/>
-              <w:bottom w:w="80" w:type="dxa"/>
-              <w:start w:w="120" w:type="dxa"/>
-              <w:end w:w="120" w:type="dxa"/>
-            </w:tcMar>
-          </w:tcPr>
-          <w:p>
-            <w:pPr>
-              <w:spacing w:after="0"/>
-            </w:pPr>
-            <w:r>
-              <w:rPr>
-                <w:rFonts w:ascii="Calibri" w:hAnsi="Calibri"/>
-                <w:b w:val="0"/>
-                <w:i w:val="0"/>
-                <w:color w:val="202124"/>
-                <w:sz w:val="17"/>
-              </w:rPr>
-              <w:t>Probabilistic and conformal forecast intervals</w:t>
-            </w:r>
-          </w:p>
-        </w:tc>
-        <w:tc>
-          <w:tcPr>
-            <w:tcW w:type="dxa" w:w="2980"/>
-            <w:vAlign w:val="center"/>
-            <w:tcMar>
-              <w:top w:w="80" w:type="dxa"/>
-              <w:bottom w:w="80" w:type="dxa"/>
-              <w:start w:w="120" w:type="dxa"/>
-              <w:end w:w="120" w:type="dxa"/>
-            </w:tcMar>
-          </w:tcPr>
-          <w:p>
-            <w:pPr>
-              <w:spacing w:after="0"/>
-            </w:pPr>
-            <w:r>
-              <w:rPr>
-                <w:rFonts w:ascii="Calibri" w:hAnsi="Calibri"/>
-                <w:b w:val="0"/>
-                <w:i w:val="0"/>
-                <w:color w:val="202124"/>
-                <w:sz w:val="17"/>
-              </w:rPr>
-              <w:t>Current 4Q intervals under-cover and may overstate certainty</w:t>
-            </w:r>
-          </w:p>
-        </w:tc>
-        <w:tc>
-          <w:tcPr>
-            <w:tcW w:type="dxa" w:w="2830"/>
-            <w:vAlign w:val="center"/>
-            <w:tcMar>
-              <w:top w:w="80" w:type="dxa"/>
-              <w:bottom w:w="80" w:type="dxa"/>
-              <w:start w:w="120" w:type="dxa"/>
-              <w:end w:w="120" w:type="dxa"/>
-            </w:tcMar>
-          </w:tcPr>
-          <w:p>
-            <w:pPr>
-              <w:spacing w:after="0"/>
-            </w:pPr>
-            <w:r>
-              <w:rPr>
-                <w:rFonts w:ascii="Calibri" w:hAnsi="Calibri"/>
-                <w:b w:val="0"/>
-                <w:i w:val="0"/>
-                <w:color w:val="202124"/>
-                <w:sz w:val="17"/>
-              </w:rPr>
-              <w:t>Empirical coverage near nominal across KPI, sector, and horizon</w:t>
-            </w:r>
-          </w:p>
-        </w:tc>
-      </w:tr>
-      <w:tr>
-        <w:tc>
-          <w:tcPr>
-            <w:tcW w:type="dxa" w:w="700"/>
-            <w:vAlign w:val="center"/>
-            <w:tcMar>
-              <w:top w:w="80" w:type="dxa"/>
-              <w:bottom w:w="80" w:type="dxa"/>
-              <w:start w:w="120" w:type="dxa"/>
-              <w:end w:w="120" w:type="dxa"/>
-            </w:tcMar>
-          </w:tcPr>
-          <w:p>
-            <w:pPr>
-              <w:spacing w:after="0"/>
-            </w:pPr>
-            <w:r>
-              <w:rPr>
-                <w:rFonts w:ascii="Calibri" w:hAnsi="Calibri"/>
-                <w:b w:val="0"/>
-                <w:i w:val="0"/>
-                <w:color w:val="202124"/>
-                <w:sz w:val="17"/>
-              </w:rPr>
-              <w:t>5</w:t>
-            </w:r>
-          </w:p>
-        </w:tc>
-        <w:tc>
-          <w:tcPr>
-            <w:tcW w:type="dxa" w:w="2850"/>
-            <w:vAlign w:val="center"/>
-            <w:tcMar>
-              <w:top w:w="80" w:type="dxa"/>
-              <w:bottom w:w="80" w:type="dxa"/>
-              <w:start w:w="120" w:type="dxa"/>
-              <w:end w:w="120" w:type="dxa"/>
-            </w:tcMar>
-          </w:tcPr>
-          <w:p>
-            <w:pPr>
-              <w:spacing w:after="0"/>
-            </w:pPr>
-            <w:r>
-              <w:rPr>
-                <w:rFonts w:ascii="Calibri" w:hAnsi="Calibri"/>
-                <w:b w:val="0"/>
-                <w:i w:val="0"/>
-                <w:color w:val="202124"/>
-                <w:sz w:val="17"/>
-              </w:rPr>
-              <w:t>Cost-sensitive threshold and analyst-capacity optimization</w:t>
-            </w:r>
-          </w:p>
-        </w:tc>
-        <w:tc>
-          <w:tcPr>
-            <w:tcW w:type="dxa" w:w="2980"/>
-            <w:vAlign w:val="center"/>
-            <w:tcMar>
-              <w:top w:w="80" w:type="dxa"/>
-              <w:bottom w:w="80" w:type="dxa"/>
-              <w:start w:w="120" w:type="dxa"/>
-              <w:end w:w="120" w:type="dxa"/>
-            </w:tcMar>
-          </w:tcPr>
-          <w:p>
-            <w:pPr>
-              <w:spacing w:after="0"/>
-            </w:pPr>
-            <w:r>
-              <w:rPr>
-                <w:rFonts w:ascii="Calibri" w:hAnsi="Calibri"/>
-                <w:b w:val="0"/>
-                <w:i w:val="0"/>
-                <w:color w:val="202124"/>
-                <w:sz w:val="17"/>
-              </w:rPr>
-              <w:t>Alert value depends on review cost, missed-event cost, and queue size</w:t>
-            </w:r>
-          </w:p>
-        </w:tc>
-        <w:tc>
-          <w:tcPr>
-            <w:tcW w:type="dxa" w:w="2830"/>
-            <w:vAlign w:val="center"/>
-            <w:tcMar>
-              <w:top w:w="80" w:type="dxa"/>
-              <w:bottom w:w="80" w:type="dxa"/>
-              <w:start w:w="120" w:type="dxa"/>
-              <w:end w:w="120" w:type="dxa"/>
-            </w:tcMar>
-          </w:tcPr>
-          <w:p>
-            <w:pPr>
-              <w:spacing w:after="0"/>
-            </w:pPr>
-            <w:r>
-              <w:rPr>
-                <w:rFonts w:ascii="Calibri" w:hAnsi="Calibri"/>
-                <w:b w:val="0"/>
-                <w:i w:val="0"/>
-                <w:color w:val="202124"/>
-                <w:sz w:val="17"/>
-              </w:rPr>
-              <w:t>Decision-curve analysis and capacity-constrained backtest</w:t>
-            </w:r>
-          </w:p>
-        </w:tc>
-      </w:tr>
-      <w:tr>
-        <w:tc>
-          <w:tcPr>
-            <w:tcW w:type="dxa" w:w="700"/>
-            <w:vAlign w:val="center"/>
-            <w:tcMar>
-              <w:top w:w="80" w:type="dxa"/>
-              <w:bottom w:w="80" w:type="dxa"/>
-              <w:start w:w="120" w:type="dxa"/>
-              <w:end w:w="120" w:type="dxa"/>
-            </w:tcMar>
-          </w:tcPr>
-          <w:p>
-            <w:pPr>
-              <w:spacing w:after="0"/>
-            </w:pPr>
-            <w:r>
-              <w:rPr>
-                <w:rFonts w:ascii="Calibri" w:hAnsi="Calibri"/>
-                <w:b w:val="0"/>
-                <w:i w:val="0"/>
-                <w:color w:val="202124"/>
-                <w:sz w:val="17"/>
-              </w:rPr>
-              <w:t>6</w:t>
-            </w:r>
-          </w:p>
-        </w:tc>
-        <w:tc>
-          <w:tcPr>
-            <w:tcW w:type="dxa" w:w="2850"/>
-            <w:vAlign w:val="center"/>
-            <w:tcMar>
-              <w:top w:w="80" w:type="dxa"/>
-              <w:bottom w:w="80" w:type="dxa"/>
-              <w:start w:w="120" w:type="dxa"/>
-              <w:end w:w="120" w:type="dxa"/>
-            </w:tcMar>
-          </w:tcPr>
-          <w:p>
-            <w:pPr>
-              <w:spacing w:after="0"/>
-            </w:pPr>
-            <w:r>
-              <w:rPr>
-                <w:rFonts w:ascii="Calibri" w:hAnsi="Calibri"/>
-                <w:b w:val="0"/>
-                <w:i w:val="0"/>
-                <w:color w:val="202124"/>
-                <w:sz w:val="17"/>
-              </w:rPr>
-              <w:t>Explainability and analyst evidence packets</w:t>
-            </w:r>
-          </w:p>
-        </w:tc>
-        <w:tc>
-          <w:tcPr>
-            <w:tcW w:type="dxa" w:w="2980"/>
-            <w:vAlign w:val="center"/>
-            <w:tcMar>
-              <w:top w:w="80" w:type="dxa"/>
-              <w:bottom w:w="80" w:type="dxa"/>
-              <w:start w:w="120" w:type="dxa"/>
-              <w:end w:w="120" w:type="dxa"/>
-            </w:tcMar>
-          </w:tcPr>
-          <w:p>
-            <w:pPr>
-              <w:spacing w:after="0"/>
-            </w:pPr>
-            <w:r>
-              <w:rPr>
-                <w:rFonts w:ascii="Calibri" w:hAnsi="Calibri"/>
-                <w:b w:val="0"/>
-                <w:i w:val="0"/>
-                <w:color w:val="202124"/>
-                <w:sz w:val="17"/>
-              </w:rPr>
-              <w:t>Global feature importance is insufficient for individual review</w:t>
-            </w:r>
-          </w:p>
-        </w:tc>
-        <w:tc>
-          <w:tcPr>
-            <w:tcW w:type="dxa" w:w="2830"/>
-            <w:vAlign w:val="center"/>
-            <w:tcMar>
-              <w:top w:w="80" w:type="dxa"/>
-              <w:bottom w:w="80" w:type="dxa"/>
-              <w:start w:w="120" w:type="dxa"/>
-              <w:end w:w="120" w:type="dxa"/>
-            </w:tcMar>
-          </w:tcPr>
-          <w:p>
-            <w:pPr>
-              <w:spacing w:after="0"/>
-            </w:pPr>
-            <w:r>
-              <w:rPr>
-                <w:rFonts w:ascii="Calibri" w:hAnsi="Calibri"/>
-                <w:b w:val="0"/>
-                <w:i w:val="0"/>
-                <w:color w:val="202124"/>
-                <w:sz w:val="17"/>
-              </w:rPr>
-              <w:t>Local explanations tied to source facts, peer context, and uncertainty</w:t>
-            </w:r>
-          </w:p>
-        </w:tc>
-      </w:tr>
-      <w:tr>
-        <w:tc>
-          <w:tcPr>
-            <w:tcW w:type="dxa" w:w="700"/>
-            <w:vAlign w:val="center"/>
-            <w:tcMar>
-              <w:top w:w="80" w:type="dxa"/>
-              <w:bottom w:w="80" w:type="dxa"/>
-              <w:start w:w="120" w:type="dxa"/>
-              <w:end w:w="120" w:type="dxa"/>
-            </w:tcMar>
-          </w:tcPr>
-          <w:p>
-            <w:pPr>
-              <w:spacing w:after="0"/>
-            </w:pPr>
-            <w:r>
-              <w:rPr>
-                <w:rFonts w:ascii="Calibri" w:hAnsi="Calibri"/>
-                <w:b w:val="0"/>
-                <w:i w:val="0"/>
-                <w:color w:val="202124"/>
-                <w:sz w:val="17"/>
-              </w:rPr>
-              <w:t>7</w:t>
-            </w:r>
-          </w:p>
-        </w:tc>
-        <w:tc>
-          <w:tcPr>
-            <w:tcW w:type="dxa" w:w="2850"/>
-            <w:vAlign w:val="center"/>
-            <w:tcMar>
-              <w:top w:w="80" w:type="dxa"/>
-              <w:bottom w:w="80" w:type="dxa"/>
-              <w:start w:w="120" w:type="dxa"/>
-              <w:end w:w="120" w:type="dxa"/>
-            </w:tcMar>
-          </w:tcPr>
-          <w:p>
-            <w:pPr>
-              <w:spacing w:after="0"/>
-            </w:pPr>
-            <w:r>
-              <w:rPr>
-                <w:rFonts w:ascii="Calibri" w:hAnsi="Calibri"/>
-                <w:b w:val="0"/>
-                <w:i w:val="0"/>
-                <w:color w:val="202124"/>
-                <w:sz w:val="17"/>
-              </w:rPr>
-              <w:t>Complete Power BI visual bindings and usability testing</w:t>
-            </w:r>
-          </w:p>
-        </w:tc>
-        <w:tc>
-          <w:tcPr>
-            <w:tcW w:type="dxa" w:w="2980"/>
-            <w:vAlign w:val="center"/>
-            <w:tcMar>
-              <w:top w:w="80" w:type="dxa"/>
-              <w:bottom w:w="80" w:type="dxa"/>
-              <w:start w:w="120" w:type="dxa"/>
-              <w:end w:w="120" w:type="dxa"/>
-            </w:tcMar>
-          </w:tcPr>
-          <w:p>
-            <w:pPr>
-              <w:spacing w:after="0"/>
-            </w:pPr>
-            <w:r>
-              <w:rPr>
-                <w:rFonts w:ascii="Calibri" w:hAnsi="Calibri"/>
-                <w:b w:val="0"/>
-                <w:i w:val="0"/>
-                <w:color w:val="202124"/>
-                <w:sz w:val="17"/>
-              </w:rPr>
-              <w:t>A valid model package is not yet a polished decision interface</w:t>
-            </w:r>
-          </w:p>
-        </w:tc>
-        <w:tc>
-          <w:tcPr>
-            <w:tcW w:type="dxa" w:w="2830"/>
-            <w:vAlign w:val="center"/>
-            <w:tcMar>
-              <w:top w:w="80" w:type="dxa"/>
-              <w:bottom w:w="80" w:type="dxa"/>
-              <w:start w:w="120" w:type="dxa"/>
-              <w:end w:w="120" w:type="dxa"/>
-            </w:tcMar>
-          </w:tcPr>
-          <w:p>
-            <w:pPr>
-              <w:spacing w:after="0"/>
-            </w:pPr>
-            <w:r>
-              <w:rPr>
-                <w:rFonts w:ascii="Calibri" w:hAnsi="Calibri"/>
-                <w:b w:val="0"/>
-                <w:i w:val="0"/>
-                <w:color w:val="202124"/>
-                <w:sz w:val="17"/>
-              </w:rPr>
-              <w:t>All required visuals populated; accessibility QA; analyst task testing</w:t>
-            </w:r>
-          </w:p>
-        </w:tc>
-      </w:tr>
-      <w:tr>
-        <w:tc>
-          <w:tcPr>
-            <w:tcW w:type="dxa" w:w="700"/>
-            <w:vAlign w:val="center"/>
-            <w:tcMar>
-              <w:top w:w="80" w:type="dxa"/>
-              <w:bottom w:w="80" w:type="dxa"/>
-              <w:start w:w="120" w:type="dxa"/>
-              <w:end w:w="120" w:type="dxa"/>
-            </w:tcMar>
-          </w:tcPr>
-          <w:p>
-            <w:pPr>
-              <w:spacing w:after="0"/>
-            </w:pPr>
-            <w:r>
-              <w:rPr>
-                <w:rFonts w:ascii="Calibri" w:hAnsi="Calibri"/>
-                <w:b w:val="0"/>
-                <w:i w:val="0"/>
-                <w:color w:val="202124"/>
-                <w:sz w:val="17"/>
-              </w:rPr>
-              <w:t>8</w:t>
-            </w:r>
-          </w:p>
-        </w:tc>
-        <w:tc>
-          <w:tcPr>
-            <w:tcW w:type="dxa" w:w="2850"/>
-            <w:vAlign w:val="center"/>
-            <w:tcMar>
-              <w:top w:w="80" w:type="dxa"/>
-              <w:bottom w:w="80" w:type="dxa"/>
-              <w:start w:w="120" w:type="dxa"/>
-              <w:end w:w="120" w:type="dxa"/>
-            </w:tcMar>
-          </w:tcPr>
-          <w:p>
-            <w:pPr>
-              <w:spacing w:after="0"/>
-            </w:pPr>
-            <w:r>
-              <w:rPr>
-                <w:rFonts w:ascii="Calibri" w:hAnsi="Calibri"/>
-                <w:b w:val="0"/>
-                <w:i w:val="0"/>
-                <w:color w:val="202124"/>
-                <w:sz w:val="17"/>
-              </w:rPr>
-              <w:t>Benchmark modern survival, sequence, and panel methods</w:t>
-            </w:r>
-          </w:p>
-        </w:tc>
-        <w:tc>
-          <w:tcPr>
-            <w:tcW w:type="dxa" w:w="2980"/>
-            <w:vAlign w:val="center"/>
-            <w:tcMar>
-              <w:top w:w="80" w:type="dxa"/>
-              <w:bottom w:w="80" w:type="dxa"/>
-              <w:start w:w="120" w:type="dxa"/>
-              <w:end w:w="120" w:type="dxa"/>
-            </w:tcMar>
-          </w:tcPr>
-          <w:p>
-            <w:pPr>
-              <w:spacing w:after="0"/>
-            </w:pPr>
-            <w:r>
-              <w:rPr>
-                <w:rFonts w:ascii="Calibri" w:hAnsi="Calibri"/>
-                <w:b w:val="0"/>
-                <w:i w:val="0"/>
-                <w:color w:val="202124"/>
-                <w:sz w:val="17"/>
-              </w:rPr>
-              <w:t>Alternative methods may better model time-to-event and repeated-company structure</w:t>
-            </w:r>
-          </w:p>
-        </w:tc>
-        <w:tc>
-          <w:tcPr>
-            <w:tcW w:type="dxa" w:w="2830"/>
-            <w:vAlign w:val="center"/>
-            <w:tcMar>
-              <w:top w:w="80" w:type="dxa"/>
-              <w:bottom w:w="80" w:type="dxa"/>
-              <w:start w:w="120" w:type="dxa"/>
-              <w:end w:w="120" w:type="dxa"/>
-            </w:tcMar>
-          </w:tcPr>
-          <w:p>
-            <w:pPr>
-              <w:spacing w:after="0"/>
-            </w:pPr>
-            <w:r>
-              <w:rPr>
-                <w:rFonts w:ascii="Calibri" w:hAnsi="Calibri"/>
-                <w:b w:val="0"/>
-                <w:i w:val="0"/>
-                <w:color w:val="202124"/>
-                <w:sz w:val="17"/>
-              </w:rPr>
-              <w:t>Temporal comparisons versus current baselines with complexity penalties</w:t>
-            </w:r>
-          </w:p>
-        </w:tc>
-      </w:tr>
-    </w:tbl>
-    <w:p>
-      <w:pPr>
-        <w:spacing w:after="0"/>
-      </w:pPr>
-    </w:p>
-    <w:p>
-      <w:pPr>
-        <w:spacing w:after="120" w:line="264" w:lineRule="auto"/>
-      </w:pPr>
-      <w:r>
-        <w:rPr>
-          <w:rFonts w:ascii="Calibri" w:hAnsi="Calibri"/>
-          <w:b w:val="0"/>
-          <w:i w:val="0"/>
-          <w:color w:val="202124"/>
-          <w:sz w:val="21"/>
-        </w:rPr>
-        <w:t>Phase 2 should retain the Phase 1 governance principle: every increase in methodological sophistication must earn its place through leakage-safe out-of-time evidence, calibration, stability, interpretability, and operational utility. Deep or sequence models should not be adopted merely because they are modern; their data requirements and variance must be justified against transparent baselines.</w:t>
       </w:r>
     </w:p>
     <w:p>
@@ -4811,7 +5224,7 @@
                 <w:color w:val="202124"/>
                 <w:sz w:val="17"/>
               </w:rPr>
-              <w:t>Power BI reconciliation</w:t>
+              <w:t>Analysis reconciliation</w:t>
             </w:r>
           </w:p>
         </w:tc>
@@ -4838,7 +5251,7 @@
                 <w:color w:val="202124"/>
                 <w:sz w:val="17"/>
               </w:rPr>
-              <w:t>2 portfolio rows, 60 unique CIKs, 3,150 unique decision keys, 93 performance rows</w:t>
+              <w:t>60 unique companies, 3,150 unique decision records, and 93 model-performance records</w:t>
             </w:r>
           </w:p>
         </w:tc>
@@ -4867,7 +5280,7 @@
                 <w:color w:val="202124"/>
                 <w:sz w:val="17"/>
               </w:rPr>
-              <w:t>Release artifacts</w:t>
+              <w:t>Release evidence</w:t>
             </w:r>
           </w:p>
         </w:tc>
@@ -4894,7 +5307,7 @@
                 <w:color w:val="202124"/>
                 <w:sz w:val="17"/>
               </w:rPr>
-              <w:t>Certified XLSX, PBIX, four page screenshots, validation notes, source documentation, and tests</w:t>
+              <w:t>Certified analysis workbook, publication figures, source documentation, and automated tests</w:t>
             </w:r>
           </w:p>
         </w:tc>
@@ -4917,7 +5330,7 @@
           <w:color w:val="202124"/>
           <w:sz w:val="21"/>
         </w:rPr>
-        <w:t>Primary internal references: README.md; docs/point_in_time_policy.md; docs/label_specification.md; docs/model_card.md; docs/modeling_lineage.md; docs/stages_0_7_execution.md through docs/stages_17_18_execution.md; and the certified Power BI import workbook. External data originate from SEC EDGAR and FRED/ALFRED under their respective public usage policies.</w:t>
+        <w:t>Primary internal references: README.md; docs/point_in_time_policy.md; docs/label_specification.md; docs/model_card.md; docs/modeling_lineage.md; and the stage execution records. External data originate from SEC EDGAR and FRED/ALFRED under their respective public usage policies.</w:t>
       </w:r>
     </w:p>
     <w:p>

</xml_diff>

<commit_message>
Clarify sector financial constraint interpretation
</commit_message>
<xml_diff>
--- a/reports/publication/Corporate_Financial_Deterioration_Phase1_Research_Report.docx
+++ b/reports/publication/Corporate_Financial_Deterioration_Phase1_Research_Report.docx
@@ -1386,6 +1386,31 @@
           <w:sz w:val="21"/>
         </w:rPr>
         <w:t>Interest coverage is the central debt-service construct because it compares operating earnings with interest burden. Free-cash-flow margin measures internally generated liquidity after investment needs. Debt-to-assets represents balance-sheet leverage and creditor claim intensity. The three measures are complementary: coverage captures service capacity, cash flow captures funding resilience, and leverage captures structural exposure.</w:t>
+      </w:r>
+    </w:p>
+    <w:p>
+      <w:pPr>
+        <w:spacing w:after="120" w:line="264" w:lineRule="auto"/>
+      </w:pPr>
+      <w:r>
+        <w:rPr>
+          <w:rFonts w:ascii="Calibri" w:hAnsi="Calibri"/>
+          <w:b/>
+          <w:i w:val="0"/>
+          <w:color w:val="17365D"/>
+          <w:sz w:val="21"/>
+        </w:rPr>
+        <w:t>How to interpret the sector comparison.</w:t>
+      </w:r>
+      <w:r>
+        <w:rPr>
+          <w:rFonts w:ascii="Calibri" w:hAnsi="Calibri"/>
+          <w:b w:val="0"/>
+          <w:i w:val="0"/>
+          <w:color w:val="202124"/>
+          <w:sz w:val="21"/>
+        </w:rPr>
+        <w:t xml:space="preserve"> The statement that Utilities are more financially constrained is true within this study's 60-company sample: their median interest coverage is lower, free-cash-flow margin is weaker, debt-to-assets is higher, and short-term liquidity is lower. It should not be generalized into a claim that every utility is less financially healthy than every Consumer Discretionary company. Much of the difference reflects how the industries operate. Utilities must continually fund long-lived generation, transmission, distribution, and environmental infrastructure. These investments create large depreciation charges, sustained capital expenditure, and recurring debt or equity financing needs. Regulated utilities generally recover prudent operating and capital costs through customer rates and earn an allowed return on their rate base, but regulatory approval and cost recovery can occur with a lag. This produces relatively stable demand and revenue while leaving cash flow and interest coverage sensitive to borrowing costs, construction programs, and regulatory timing. Consumer Discretionary businesses generally face less uniform capital requirements and can show stronger coverage and cash generation, but their revenue and margins are more exposed to consumer confidence, employment, inflation, competition, and discretionary spending cycles. In financial-health terms, a Utility's higher leverage or negative free cash flow can be sustainable when supported by predictable regulated cash flows and timely rate recovery; concern increases when leverage rises while coverage falls, financing costs increase, or regulatory recovery is delayed. Conversely, a Consumer Discretionary company can appear stronger on normal-period ratios yet deteriorate faster when demand or margins contract.</w:t>
       </w:r>
     </w:p>
     <w:p>
@@ -5330,7 +5355,7 @@
           <w:color w:val="202124"/>
           <w:sz w:val="21"/>
         </w:rPr>
-        <w:t>Primary internal references: README.md; docs/point_in_time_policy.md; docs/label_specification.md; docs/model_card.md; docs/modeling_lineage.md; and the stage execution records. External data originate from SEC EDGAR and FRED/ALFRED under their respective public usage policies.</w:t>
+        <w:t>Primary internal references: README.md; docs/point_in_time_policy.md; docs/label_specification.md; docs/model_card.md; docs/modeling_lineage.md; and the stage execution records. External data originate from SEC EDGAR and FRED/ALFRED under their respective public usage policies. Industry interpretation is consistent with U.S. Energy Information Administration descriptions of regulated utility revenue requirements and rate-recovery lags and Federal Energy Regulatory Commission guidance explaining cost-of-service recovery, capital investment, and financing returns.</w:t>
       </w:r>
     </w:p>
     <w:p>

</xml_diff>

<commit_message>
Simplify model inputs and evaluation explanation
</commit_message>
<xml_diff>
--- a/reports/publication/Corporate_Financial_Deterioration_Phase1_Research_Report.docx
+++ b/reports/publication/Corporate_Financial_Deterioration_Phase1_Research_Report.docx
@@ -3225,12 +3225,22 @@
       <w:r>
         <w:rPr>
           <w:rFonts w:ascii="Calibri" w:hAnsi="Calibri"/>
+          <w:b/>
+          <w:i w:val="0"/>
+          <w:color w:val="17365D"/>
+          <w:sz w:val="21"/>
+        </w:rPr>
+        <w:t>How information was added to the model.</w:t>
+      </w:r>
+      <w:r>
+        <w:rPr>
+          <w:rFonts w:ascii="Calibri" w:hAnsi="Calibri"/>
           <w:b w:val="0"/>
           <w:i w:val="0"/>
           <w:color w:val="202124"/>
           <w:sz w:val="21"/>
         </w:rPr>
-        <w:t>Feature increments were prespecified: historical fundamentals, peer-relative ranks, leakage-safe forecasts, macro variables, and limited sector interactions. Choosing the method at each increment is important: peer normalization addresses cross-sectional structure; time-series forecasts summarize trajectory; macro features represent common shocks; restricted interactions allow heterogeneous sensitivities without an uncontrolled search.</w:t>
+        <w:t xml:space="preserve"> Before testing began, the research plan specified five groups of information to examine: (1) each company's current and past financial ratios, (2) its position relative to companies in the same sector, (3) forecasts of where its ratios may be heading, built without using future information, (4) economic conditions such as interest rates and business-cycle measures, and (5) a small number of sector-specific combinations.</w:t>
       </w:r>
     </w:p>
     <w:p>
@@ -3240,12 +3250,47 @@
       <w:r>
         <w:rPr>
           <w:rFonts w:ascii="Calibri" w:hAnsi="Calibri"/>
+          <w:b/>
+          <w:i w:val="0"/>
+          <w:color w:val="17365D"/>
+          <w:sz w:val="21"/>
+        </w:rPr>
+        <w:t>Why test the groups separately?</w:t>
+      </w:r>
+      <w:r>
+        <w:rPr>
+          <w:rFonts w:ascii="Calibri" w:hAnsi="Calibri"/>
           <w:b w:val="0"/>
           <w:i w:val="0"/>
           <w:color w:val="202124"/>
           <w:sz w:val="21"/>
         </w:rPr>
-        <w:t>Only a minority of observations are deterioration events, so simple accuracy can be misleading. PR-AUC summarizes how well the model separates deterioration cases while focusing on the less common event class. Recall is the percentage of actual events detected. Precision is the percentage of alerts that became events. Top-decile lift compares the event rate among the highest-risk 10% with the overall event rate. Brier score measures the average squared error of the probabilities, and calibration checks whether a stated risk such as 30% occurs about 30% of the time. No single measure answers every business question.</w:t>
+        <w:t xml:space="preserve"> Adding one group at a time shows whether it improves predictions and reduces cherry-picking. Peer comparisons use the correct sector benchmark; forecasts describe direction; economic variables capture shared pressures; and a few sector combinations allow the same signal to matter differently in each industry without testing thousands of unplanned relationships.</w:t>
+      </w:r>
+    </w:p>
+    <w:p>
+      <w:pPr>
+        <w:spacing w:after="120" w:line="264" w:lineRule="auto"/>
+      </w:pPr>
+      <w:r>
+        <w:rPr>
+          <w:rFonts w:ascii="Calibri" w:hAnsi="Calibri"/>
+          <w:b/>
+          <w:i w:val="0"/>
+          <w:color w:val="17365D"/>
+          <w:sz w:val="21"/>
+        </w:rPr>
+        <w:t>Why accuracy alone is misleading.</w:t>
+      </w:r>
+      <w:r>
+        <w:rPr>
+          <w:rFonts w:ascii="Calibri" w:hAnsi="Calibri"/>
+          <w:b w:val="0"/>
+          <w:i w:val="0"/>
+          <w:color w:val="202124"/>
+          <w:sz w:val="21"/>
+        </w:rPr>
+        <w:t xml:space="preserve"> Deterioration occurred in about 21% of observations. Predicting “no deterioration” every time would therefore appear roughly 79% accurate while finding no important cases. PR-AUC measures how well actual deterioration cases are ranked ahead of non-events. Recall is the share of actual cases detected; precision is the share of alerts that became cases. Top-decile lift compares the highest-risk 10% with the portfolio average. Brier score measures probability error, while calibration checks whether predicted risks match observed frequencies. The measures answer different questions and should be reviewed together.</w:t>
       </w:r>
     </w:p>
     <w:p>

</xml_diff>

<commit_message>
Clarify model performance versus sector risk
</commit_message>
<xml_diff>
--- a/reports/publication/Corporate_Financial_Deterioration_Phase1_Research_Report.docx
+++ b/reports/publication/Corporate_Financial_Deterioration_Phase1_Research_Report.docx
@@ -4228,12 +4228,62 @@
       <w:r>
         <w:rPr>
           <w:rFonts w:ascii="Calibri" w:hAnsi="Calibri"/>
+          <w:b/>
+          <w:i w:val="0"/>
+          <w:color w:val="17365D"/>
+          <w:sz w:val="21"/>
+        </w:rPr>
+        <w:t>Model performance is not the same as sector risk.</w:t>
+      </w:r>
+      <w:r>
+        <w:rPr>
+          <w:rFonts w:ascii="Calibri" w:hAnsi="Calibri"/>
           <w:b w:val="0"/>
           <w:i w:val="0"/>
           <w:color w:val="202124"/>
           <w:sz w:val="21"/>
         </w:rPr>
-        <w:t>The Utilities gap is important: PR-AUC and precision are lower even though the Brier score is slightly better. This shows why ranking quality and probability accuracy must be reviewed separately. A model can produce fairly conservative probabilities yet still rank the actual deterioration cases imperfectly. The weaker Utilities result limits how confidently the model should be applied to that sector.</w:t>
+        <w:t xml:space="preserve"> Consumer Discretionary's higher PR-AUC (0.468 versus 0.332) means the model was better at placing that sector's actual deterioration cases above its non-events. It does not mean that every Consumer Discretionary company is riskier, or that the sector has weaker average finances. The exploratory results show the opposite at the median: Consumer Discretionary has stronger coverage, better free cash flow, and lower leverage. Those median ratios describe the typical company; PR-AUC describes how accurately the model separates the weaker companies from the stronger companies within a sector.</w:t>
+      </w:r>
+    </w:p>
+    <w:p>
+      <w:pPr>
+        <w:spacing w:after="120" w:line="264" w:lineRule="auto"/>
+      </w:pPr>
+      <w:r>
+        <w:rPr>
+          <w:rFonts w:ascii="Calibri" w:hAnsi="Calibri"/>
+          <w:b/>
+          <w:i w:val="0"/>
+          <w:color w:val="17365D"/>
+          <w:sz w:val="21"/>
+        </w:rPr>
+        <w:t>Why can stronger median KPIs coexist with deterioration risk?</w:t>
+      </w:r>
+      <w:r>
+        <w:rPr>
+          <w:rFonts w:ascii="Calibri" w:hAnsi="Calibri"/>
+          <w:b w:val="0"/>
+          <w:i w:val="0"/>
+          <w:color w:val="202124"/>
+          <w:sz w:val="21"/>
+        </w:rPr>
+        <w:t xml:space="preserve"> Consumer Discretionary had wider differences between companies and greater sensitivity to economic cycles. Most firms can therefore look financially strong while a smaller group experiences sharp declines. The study's event definition also requires both coverage below 1.5x and a decline of at least 40%, so it measures a transition into serious deterioration rather than a sector's normal financial structure. Across the full history, the event rate was only slightly higher for Consumer Discretionary (22.2%) than Utilities (20.7%). At the latest snapshot, both sectors generated 11 alerts; Consumer Discretionary had six observed events versus four for Utilities and a modestly higher average predicted risk (29.36% versus 26.91%). Utilities had weaker typical ratios, but their ratios were more tightly clustered and often persistently low, making new deterioration cases harder for the model to distinguish. The lower Utilities PR-AUC and precision therefore indicate weaker classification—not proof that Utilities are safer.</w:t>
+      </w:r>
+    </w:p>
+    <w:p>
+      <w:pPr>
+        <w:spacing w:after="120" w:line="264" w:lineRule="auto"/>
+      </w:pPr>
+      <w:r>
+        <w:rPr>
+          <w:rFonts w:ascii="Calibri" w:hAnsi="Calibri"/>
+          <w:b w:val="0"/>
+          <w:i w:val="0"/>
+          <w:color w:val="202124"/>
+          <w:sz w:val="21"/>
+        </w:rPr>
+        <w:t>The Utilities Brier score was slightly better despite weaker PR-AUC and precision. In plain language, the average size of its probability errors was smaller, but the model was less successful at ordering the companies that actually deteriorated above those that did not. This is why ranking quality and probability accuracy must be reviewed separately, and why the weaker Utilities result limits how confidently the model should be applied to that sector.</w:t>
       </w:r>
     </w:p>
     <w:p>

</xml_diff>

<commit_message>
Remove duplicated sector interpretation
</commit_message>
<xml_diff>
--- a/reports/publication/Corporate_Financial_Deterioration_Phase1_Research_Report.docx
+++ b/reports/publication/Corporate_Financial_Deterioration_Phase1_Research_Report.docx
@@ -1386,31 +1386,6 @@
           <w:sz w:val="21"/>
         </w:rPr>
         <w:t>Interest coverage is the central debt-service construct because it compares operating earnings with interest burden. Free-cash-flow margin measures internally generated liquidity after investment needs. Debt-to-assets represents balance-sheet leverage and creditor claim intensity. The three measures are complementary: coverage captures service capacity, cash flow captures funding resilience, and leverage captures structural exposure.</w:t>
-      </w:r>
-    </w:p>
-    <w:p>
-      <w:pPr>
-        <w:spacing w:after="120" w:line="264" w:lineRule="auto"/>
-      </w:pPr>
-      <w:r>
-        <w:rPr>
-          <w:rFonts w:ascii="Calibri" w:hAnsi="Calibri"/>
-          <w:b/>
-          <w:i w:val="0"/>
-          <w:color w:val="17365D"/>
-          <w:sz w:val="21"/>
-        </w:rPr>
-        <w:t>How to interpret the sector comparison.</w:t>
-      </w:r>
-      <w:r>
-        <w:rPr>
-          <w:rFonts w:ascii="Calibri" w:hAnsi="Calibri"/>
-          <w:b w:val="0"/>
-          <w:i w:val="0"/>
-          <w:color w:val="202124"/>
-          <w:sz w:val="21"/>
-        </w:rPr>
-        <w:t xml:space="preserve"> The statement that Utilities are more financially constrained is true within this study's 60-company sample: their median interest coverage is lower, free-cash-flow margin is weaker, debt-to-assets is higher, and short-term liquidity is lower. It should not be generalized into a claim that every utility is less financially healthy than every Consumer Discretionary company. Much of the difference reflects how the industries operate. Utilities must continually fund long-lived generation, transmission, distribution, and environmental infrastructure. These investments create large depreciation charges, sustained capital expenditure, and recurring debt or equity financing needs. Regulated utilities generally recover prudent operating and capital costs through customer rates and earn an allowed return on their rate base, but regulatory approval and cost recovery can occur with a lag. This produces relatively stable demand and revenue while leaving cash flow and interest coverage sensitive to borrowing costs, construction programs, and regulatory timing. Consumer Discretionary businesses generally face less uniform capital requirements and can show stronger coverage and cash generation, but their revenue and margins are more exposed to consumer confidence, employment, inflation, competition, and discretionary spending cycles. In financial-health terms, a Utility's higher leverage or negative free cash flow can be sustainable when supported by predictable regulated cash flows and timely rate recovery; concern increases when leverage rises while coverage falls, financing costs increase, or regulatory recovery is delayed. Conversely, a Consumer Discretionary company can appear stronger on normal-period ratios yet deteriorate faster when demand or margins contract.</w:t>
       </w:r>
     </w:p>
     <w:p>

</xml_diff>